<commit_message>
Added Task 2 in the project report
</commit_message>
<xml_diff>
--- a/Project_Report.docx
+++ b/Project_Report.docx
@@ -5,25 +5,35 @@
     <w:p>
       <w:pPr>
         <w:pStyle w:val="Title"/>
+        <w:jc w:val="center"/>
         <w:rPr>
           <w:rFonts w:ascii="Times New Roman" w:hAnsi="Times New Roman" w:cs="Times New Roman"/>
-        </w:rPr>
-      </w:pPr>
-      <w:r>
-        <w:t xml:space="preserve">                                   </w:t>
-      </w:r>
+          <w:sz w:val="72"/>
+          <w:szCs w:val="72"/>
+        </w:rPr>
+      </w:pPr>
       <w:r>
         <w:rPr>
           <w:rFonts w:ascii="Times New Roman" w:hAnsi="Times New Roman" w:cs="Times New Roman"/>
-        </w:rPr>
-        <w:t xml:space="preserve">Task 1 </w:t>
+          <w:sz w:val="72"/>
+          <w:szCs w:val="72"/>
+        </w:rPr>
+        <w:t>Task 1</w:t>
       </w:r>
     </w:p>
     <w:p>
       <w:pPr>
         <w:pStyle w:val="Heading1"/>
-      </w:pPr>
-      <w:r>
+        <w:rPr>
+          <w:sz w:val="44"/>
+          <w:szCs w:val="44"/>
+        </w:rPr>
+      </w:pPr>
+      <w:r>
+        <w:rPr>
+          <w:sz w:val="44"/>
+          <w:szCs w:val="44"/>
+        </w:rPr>
         <w:t>Create a Digital Literacy Awareness Infographic</w:t>
       </w:r>
     </w:p>
@@ -31,174 +41,432 @@
     <w:p>
       <w:pPr>
         <w:pStyle w:val="NormalWeb"/>
-      </w:pPr>
-      <w:r>
+        <w:rPr>
+          <w:sz w:val="36"/>
+          <w:szCs w:val="36"/>
+        </w:rPr>
+      </w:pPr>
+      <w:r>
+        <w:rPr>
+          <w:sz w:val="36"/>
+          <w:szCs w:val="36"/>
+        </w:rPr>
         <w:t xml:space="preserve">I created my infographic using </w:t>
       </w:r>
       <w:r>
         <w:rPr>
           <w:rStyle w:val="whitespace-normal"/>
           <w:rFonts w:eastAsiaTheme="majorEastAsia"/>
+          <w:sz w:val="36"/>
+          <w:szCs w:val="36"/>
         </w:rPr>
         <w:t>Canva</w:t>
       </w:r>
       <w:r>
+        <w:rPr>
+          <w:sz w:val="36"/>
+          <w:szCs w:val="36"/>
+        </w:rPr>
         <w:t xml:space="preserve">, which is an </w:t>
       </w:r>
       <w:proofErr w:type="gramStart"/>
       <w:r>
+        <w:rPr>
+          <w:sz w:val="36"/>
+          <w:szCs w:val="36"/>
+        </w:rPr>
         <w:t>easy to use</w:t>
       </w:r>
       <w:proofErr w:type="gramEnd"/>
       <w:r>
+        <w:rPr>
+          <w:sz w:val="36"/>
+          <w:szCs w:val="36"/>
+        </w:rPr>
         <w:t xml:space="preserve"> online design tool with many ready to use templates and visual elements. I selected a Landscape infographic template and customized it according to my topic</w:t>
       </w:r>
     </w:p>
     <w:p>
       <w:pPr>
         <w:pStyle w:val="NormalWeb"/>
-      </w:pPr>
-      <w:r>
+        <w:rPr>
+          <w:sz w:val="36"/>
+          <w:szCs w:val="36"/>
+        </w:rPr>
+      </w:pPr>
+      <w:r>
+        <w:rPr>
+          <w:sz w:val="36"/>
+          <w:szCs w:val="36"/>
+        </w:rPr>
         <w:t xml:space="preserve">The topics </w:t>
       </w:r>
       <w:proofErr w:type="spellStart"/>
       <w:r>
+        <w:rPr>
+          <w:sz w:val="36"/>
+          <w:szCs w:val="36"/>
+        </w:rPr>
         <w:t>i</w:t>
       </w:r>
       <w:proofErr w:type="spellEnd"/>
       <w:r>
+        <w:rPr>
+          <w:sz w:val="36"/>
+          <w:szCs w:val="36"/>
+        </w:rPr>
         <w:t xml:space="preserve"> chose were </w:t>
       </w:r>
       <w:r>
         <w:rPr>
           <w:b/>
           <w:bCs/>
-        </w:rPr>
-        <w:t>W</w:t>
+          <w:sz w:val="36"/>
+          <w:szCs w:val="36"/>
+        </w:rPr>
+        <w:t>What digital literacy is,</w:t>
+      </w:r>
+      <w:r>
+        <w:rPr>
+          <w:rFonts w:asciiTheme="minorHAnsi" w:eastAsiaTheme="minorHAnsi" w:hAnsiTheme="minorHAnsi" w:cstheme="minorBidi"/>
+          <w:kern w:val="2"/>
+          <w:sz w:val="36"/>
+          <w:szCs w:val="36"/>
+          <w:lang w:eastAsia="en-US"/>
+          <w14:ligatures w14:val="standardContextual"/>
+        </w:rPr>
+        <w:t xml:space="preserve"> </w:t>
       </w:r>
       <w:r>
         <w:rPr>
           <w:b/>
           <w:bCs/>
-        </w:rPr>
-        <w:t>hat digital literacy is</w:t>
+          <w:sz w:val="36"/>
+          <w:szCs w:val="36"/>
+        </w:rPr>
+        <w:t>Useful digital tools for students,</w:t>
+      </w:r>
+      <w:r>
+        <w:rPr>
+          <w:rFonts w:asciiTheme="minorHAnsi" w:eastAsiaTheme="minorHAnsi" w:hAnsiTheme="minorHAnsi" w:cstheme="minorBidi"/>
+          <w:kern w:val="2"/>
+          <w:sz w:val="36"/>
+          <w:szCs w:val="36"/>
+          <w:lang w:eastAsia="en-US"/>
+          <w14:ligatures w14:val="standardContextual"/>
+        </w:rPr>
+        <w:t xml:space="preserve"> </w:t>
       </w:r>
       <w:r>
         <w:rPr>
           <w:b/>
           <w:bCs/>
-        </w:rPr>
-        <w:t>,</w:t>
-      </w:r>
-      <w:r>
-        <w:rPr>
-          <w:rFonts w:asciiTheme="minorHAnsi" w:eastAsiaTheme="minorHAnsi" w:hAnsiTheme="minorHAnsi" w:cstheme="minorBidi"/>
-          <w:kern w:val="2"/>
-          <w:lang w:eastAsia="en-US"/>
-          <w14:ligatures w14:val="standardContextual"/>
-        </w:rPr>
-        <w:t xml:space="preserve"> </w:t>
+          <w:sz w:val="36"/>
+          <w:szCs w:val="36"/>
+        </w:rPr>
+        <w:t>Email etiquette</w:t>
+      </w:r>
+    </w:p>
+    <w:p>
+      <w:pPr>
+        <w:pStyle w:val="NormalWeb"/>
+        <w:rPr>
+          <w:sz w:val="36"/>
+          <w:szCs w:val="36"/>
+        </w:rPr>
+      </w:pPr>
+      <w:r>
+        <w:rPr>
+          <w:sz w:val="36"/>
+          <w:szCs w:val="36"/>
+        </w:rPr>
+        <w:t xml:space="preserve">I explained the basic concept of digital literacy and its importance in today’s world. The second section highlights commonly used tools like document editors, note-taking apps, and communication platforms that help students improve productivity. The third section focuses on proper email etiquette, including writing clear subject lines, using polite language, and maintaining a professional tone. I also used icons and a consistent </w:t>
+      </w:r>
+      <w:proofErr w:type="spellStart"/>
+      <w:r>
+        <w:rPr>
+          <w:sz w:val="36"/>
+          <w:szCs w:val="36"/>
+        </w:rPr>
+        <w:t>color</w:t>
+      </w:r>
+      <w:proofErr w:type="spellEnd"/>
+      <w:r>
+        <w:rPr>
+          <w:sz w:val="36"/>
+          <w:szCs w:val="36"/>
+        </w:rPr>
+        <w:t xml:space="preserve"> scheme to make the infographic visually appealing and easy to understand.</w:t>
+      </w:r>
+    </w:p>
+    <w:p>
+      <w:pPr>
+        <w:pStyle w:val="NormalWeb"/>
+        <w:rPr>
+          <w:sz w:val="28"/>
+          <w:szCs w:val="28"/>
+        </w:rPr>
+      </w:pPr>
+      <w:r>
+        <w:rPr>
+          <w:sz w:val="36"/>
+          <w:szCs w:val="36"/>
+        </w:rPr>
+        <w:t>One thing I found challenging was organizing the information in a concise way without making the design look crowded</w:t>
+      </w:r>
+      <w:r>
+        <w:rPr>
+          <w:sz w:val="36"/>
+          <w:szCs w:val="36"/>
+        </w:rPr>
+        <w:t xml:space="preserve"> also finding the right imagery to represent the data was tough so that took a lot time</w:t>
+      </w:r>
+      <w:r>
+        <w:rPr>
+          <w:sz w:val="36"/>
+          <w:szCs w:val="36"/>
+        </w:rPr>
+        <w:t>. However, I found it interesting to balance visuals and text to create an engaging and informative infographic.</w:t>
+      </w:r>
+    </w:p>
+    <w:p>
+      <w:pPr>
+        <w:pStyle w:val="NormalWeb"/>
+      </w:pPr>
+    </w:p>
+    <w:p>
+      <w:pPr>
+        <w:pStyle w:val="Title"/>
+        <w:rPr>
+          <w:rFonts w:ascii="Times New Roman" w:hAnsi="Times New Roman" w:cs="Times New Roman"/>
+        </w:rPr>
+      </w:pPr>
+      <w:r>
+        <w:rPr>
+          <w:rFonts w:ascii="Times New Roman" w:hAnsi="Times New Roman" w:cs="Times New Roman"/>
+        </w:rPr>
+        <w:t xml:space="preserve">      </w:t>
+      </w:r>
+    </w:p>
+    <w:p>
+      <w:pPr>
+        <w:pStyle w:val="Title"/>
+        <w:jc w:val="center"/>
+        <w:rPr>
+          <w:rFonts w:ascii="Times New Roman" w:hAnsi="Times New Roman" w:cs="Times New Roman"/>
+          <w:sz w:val="72"/>
+          <w:szCs w:val="72"/>
+        </w:rPr>
+      </w:pPr>
+      <w:r>
+        <w:rPr>
+          <w:rFonts w:ascii="Times New Roman" w:hAnsi="Times New Roman" w:cs="Times New Roman"/>
+          <w:sz w:val="72"/>
+          <w:szCs w:val="72"/>
+        </w:rPr>
+        <w:lastRenderedPageBreak/>
+        <w:t>Task 2</w:t>
+      </w:r>
+    </w:p>
+    <w:p/>
+    <w:p>
+      <w:pPr>
+        <w:pStyle w:val="Heading1"/>
+        <w:rPr>
+          <w:sz w:val="44"/>
+          <w:szCs w:val="44"/>
+        </w:rPr>
+      </w:pPr>
+      <w:r>
+        <w:rPr>
+          <w:sz w:val="44"/>
+          <w:szCs w:val="44"/>
+        </w:rPr>
+        <w:t>Build Your Student Digital Portfolio</w:t>
+      </w:r>
+    </w:p>
+    <w:p/>
+    <w:p>
+      <w:pPr>
+        <w:pStyle w:val="NormalWeb"/>
+        <w:rPr>
+          <w:sz w:val="36"/>
+          <w:szCs w:val="36"/>
+        </w:rPr>
+      </w:pPr>
+      <w:r>
+        <w:rPr>
+          <w:sz w:val="36"/>
+          <w:szCs w:val="36"/>
+        </w:rPr>
+        <w:t xml:space="preserve">I chose to create profiles on </w:t>
       </w:r>
       <w:r>
         <w:rPr>
           <w:b/>
           <w:bCs/>
-        </w:rPr>
-        <w:t>U</w:t>
+          <w:sz w:val="36"/>
+          <w:szCs w:val="36"/>
+        </w:rPr>
+        <w:t>GitHub</w:t>
+      </w:r>
+      <w:r>
+        <w:rPr>
+          <w:sz w:val="36"/>
+          <w:szCs w:val="36"/>
+        </w:rPr>
+        <w:t xml:space="preserve">, </w:t>
       </w:r>
       <w:r>
         <w:rPr>
           <w:b/>
           <w:bCs/>
-        </w:rPr>
-        <w:t>seful digital tools for students</w:t>
+          <w:sz w:val="36"/>
+          <w:szCs w:val="36"/>
+        </w:rPr>
+        <w:t>LinkedIn</w:t>
+      </w:r>
+      <w:r>
+        <w:rPr>
+          <w:sz w:val="36"/>
+          <w:szCs w:val="36"/>
+        </w:rPr>
+        <w:t xml:space="preserve">, </w:t>
       </w:r>
       <w:r>
         <w:rPr>
           <w:b/>
           <w:bCs/>
-        </w:rPr>
-        <w:t>,</w:t>
-      </w:r>
-      <w:r>
-        <w:rPr>
-          <w:rFonts w:asciiTheme="minorHAnsi" w:eastAsiaTheme="minorHAnsi" w:hAnsiTheme="minorHAnsi" w:cstheme="minorBidi"/>
-          <w:kern w:val="2"/>
-          <w:lang w:eastAsia="en-US"/>
-          <w14:ligatures w14:val="standardContextual"/>
-        </w:rPr>
-        <w:t xml:space="preserve"> </w:t>
+          <w:sz w:val="36"/>
+          <w:szCs w:val="36"/>
+        </w:rPr>
+        <w:t>Kaggle</w:t>
+      </w:r>
+      <w:r>
+        <w:rPr>
+          <w:sz w:val="36"/>
+          <w:szCs w:val="36"/>
+        </w:rPr>
+        <w:t xml:space="preserve">, and </w:t>
       </w:r>
       <w:r>
         <w:rPr>
           <w:b/>
           <w:bCs/>
-        </w:rPr>
-        <w:t>E</w:t>
-      </w:r>
-      <w:r>
-        <w:rPr>
-          <w:b/>
-          <w:bCs/>
-        </w:rPr>
-        <w:t>mail etiquette</w:t>
+          <w:sz w:val="36"/>
+          <w:szCs w:val="36"/>
+        </w:rPr>
+        <w:t>Stack Overflow</w:t>
+      </w:r>
+      <w:r>
+        <w:rPr>
+          <w:sz w:val="36"/>
+          <w:szCs w:val="36"/>
+        </w:rPr>
+        <w:t xml:space="preserve"> because I feel these platforms will genuinely help me grow during my college journey. </w:t>
       </w:r>
     </w:p>
     <w:p>
       <w:pPr>
         <w:pStyle w:val="NormalWeb"/>
-      </w:pPr>
-      <w:r>
-        <w:t xml:space="preserve">I explained the basic concept of digital literacy and its importance in today’s world. The second section highlights commonly used tools like document editors, note-taking apps, and communication platforms that help students improve productivity. The third section focuses on proper email etiquette, including writing clear subject lines, using polite language, and maintaining a professional tone. I also used icons and a consistent </w:t>
-      </w:r>
-      <w:proofErr w:type="spellStart"/>
-      <w:r>
-        <w:t>color</w:t>
-      </w:r>
-      <w:proofErr w:type="spellEnd"/>
-      <w:r>
-        <w:t xml:space="preserve"> scheme to make the infographic visually appealing and easy to understand.</w:t>
+        <w:rPr>
+          <w:sz w:val="36"/>
+          <w:szCs w:val="36"/>
+        </w:rPr>
+      </w:pPr>
+      <w:r>
+        <w:rPr>
+          <w:sz w:val="36"/>
+          <w:szCs w:val="36"/>
+        </w:rPr>
+        <w:t xml:space="preserve">GitHub is where I plan to upload and manage my projects, so over time I can actually see how much I’ve improved. </w:t>
       </w:r>
     </w:p>
     <w:p>
       <w:pPr>
         <w:pStyle w:val="NormalWeb"/>
-      </w:pPr>
-      <w:r>
-        <w:t>One thing I found challenging was organizing the information in a concise way without making the design look crowded</w:t>
-      </w:r>
-      <w:r>
-        <w:t xml:space="preserve"> also finding the right imagery to represent the data was tough so that took a lot time</w:t>
-      </w:r>
-      <w:r>
-        <w:t>. However, I found it interesting to balance visuals and text to create an engaging and informative infographic.</w:t>
+        <w:rPr>
+          <w:sz w:val="36"/>
+          <w:szCs w:val="36"/>
+        </w:rPr>
+      </w:pPr>
+      <w:r>
+        <w:rPr>
+          <w:sz w:val="36"/>
+          <w:szCs w:val="36"/>
+        </w:rPr>
+        <w:t xml:space="preserve">LinkedIn feels important to me for building a professional identity early and staying connected with people in the tech field. </w:t>
       </w:r>
     </w:p>
     <w:p>
       <w:pPr>
         <w:pStyle w:val="NormalWeb"/>
-      </w:pPr>
+        <w:rPr>
+          <w:sz w:val="36"/>
+          <w:szCs w:val="36"/>
+        </w:rPr>
+      </w:pPr>
+      <w:r>
+        <w:rPr>
+          <w:sz w:val="36"/>
+          <w:szCs w:val="36"/>
+        </w:rPr>
+        <w:t xml:space="preserve">Kaggle is something I’m particularly interested in exploring, as it will help me understand data science and improve my problem-solving skills through real datasets. </w:t>
+      </w:r>
     </w:p>
     <w:p>
       <w:pPr>
         <w:pStyle w:val="NormalWeb"/>
-      </w:pPr>
+        <w:rPr>
+          <w:sz w:val="36"/>
+          <w:szCs w:val="36"/>
+        </w:rPr>
+      </w:pPr>
+      <w:r>
+        <w:rPr>
+          <w:sz w:val="36"/>
+          <w:szCs w:val="36"/>
+        </w:rPr>
+        <w:t>Stack Overflow is something I already find useful, since whenever I get stuck while coding, I can look for solutions or even ask questions.</w:t>
+      </w:r>
     </w:p>
     <w:p>
       <w:pPr>
         <w:pStyle w:val="NormalWeb"/>
-      </w:pPr>
-    </w:p>
-    <w:p>
-      <w:pPr>
-        <w:rPr>
-          <w:rFonts w:ascii="Times New Roman" w:hAnsi="Times New Roman" w:cs="Times New Roman"/>
-          <w:sz w:val="28"/>
-          <w:szCs w:val="28"/>
-        </w:rPr>
-      </w:pPr>
+        <w:rPr>
+          <w:sz w:val="36"/>
+          <w:szCs w:val="36"/>
+        </w:rPr>
+      </w:pPr>
+      <w:r>
+        <w:rPr>
+          <w:sz w:val="36"/>
+          <w:szCs w:val="36"/>
+        </w:rPr>
+        <w:t>Over the next four years, I want to consistently use GitHub to build a strong portfolio, while using LinkedIn to connect with others and learn about opportunities. I plan to use Kaggle to slowly improve my analytical thinking, and Stack Overflow as a support system whenever I face difficulties. Overall, I see these platforms as tools that will help me learn beyond just classroom studies.</w:t>
+      </w:r>
     </w:p>
     <w:p/>
+    <w:p>
+      <w:pPr>
+        <w:pStyle w:val="Title"/>
+        <w:jc w:val="center"/>
+        <w:rPr>
+          <w:rFonts w:ascii="Times New Roman" w:hAnsi="Times New Roman" w:cs="Times New Roman"/>
+          <w:sz w:val="72"/>
+          <w:szCs w:val="72"/>
+        </w:rPr>
+      </w:pPr>
+      <w:r>
+        <w:rPr>
+          <w:rFonts w:ascii="Times New Roman" w:hAnsi="Times New Roman" w:cs="Times New Roman"/>
+          <w:sz w:val="72"/>
+          <w:szCs w:val="72"/>
+        </w:rPr>
+        <w:lastRenderedPageBreak/>
+        <w:t>Task 3</w:t>
+      </w:r>
+    </w:p>
     <w:p/>
     <w:p>
       <w:pPr>
@@ -646,7 +914,6 @@
     <w:next w:val="Normal"/>
     <w:link w:val="Heading2Char"/>
     <w:uiPriority w:val="9"/>
-    <w:semiHidden/>
     <w:unhideWhenUsed/>
     <w:qFormat/>
     <w:rsid w:val="00754BC1"/>
@@ -821,7 +1088,6 @@
   <w:style w:type="character" w:default="1" w:styleId="DefaultParagraphFont">
     <w:name w:val="Default Paragraph Font"/>
     <w:uiPriority w:val="1"/>
-    <w:semiHidden/>
     <w:unhideWhenUsed/>
   </w:style>
   <w:style w:type="table" w:default="1" w:styleId="TableNormal">
@@ -863,7 +1129,6 @@
     <w:basedOn w:val="DefaultParagraphFont"/>
     <w:link w:val="Heading2"/>
     <w:uiPriority w:val="9"/>
-    <w:semiHidden/>
     <w:rsid w:val="00754BC1"/>
     <w:rPr>
       <w:rFonts w:asciiTheme="majorHAnsi" w:eastAsiaTheme="majorEastAsia" w:hAnsiTheme="majorHAnsi" w:cstheme="majorBidi"/>
@@ -1464,4 +1729,16 @@
     </a:ext>
   </a:extLst>
 </a:theme>
+</file>
+
+<file path=customXml/item1.xml><?xml version="1.0" encoding="utf-8"?>
+<b:Sources xmlns:b="http://schemas.openxmlformats.org/officeDocument/2006/bibliography" xmlns="http://schemas.openxmlformats.org/officeDocument/2006/bibliography" SelectedStyle="\APASixthEditionOfficeOnline.xsl" StyleName="APA" Version="6"/>
+</file>
+
+<file path=customXml/itemProps1.xml><?xml version="1.0" encoding="utf-8"?>
+<ds:datastoreItem xmlns:ds="http://schemas.openxmlformats.org/officeDocument/2006/customXml" ds:itemID="{69F9D176-820D-4990-882E-DC6AD9C90067}">
+  <ds:schemaRefs>
+    <ds:schemaRef ds:uri="http://schemas.openxmlformats.org/officeDocument/2006/bibliography"/>
+  </ds:schemaRefs>
+</ds:datastoreItem>
 </file>
</xml_diff>

<commit_message>
Added Task 3 to my project report
</commit_message>
<xml_diff>
--- a/Project_Report.docx
+++ b/Project_Report.docx
@@ -25,12 +25,14 @@
       <w:pPr>
         <w:pStyle w:val="Heading1"/>
         <w:rPr>
+          <w:rFonts w:ascii="Times New Roman" w:hAnsi="Times New Roman" w:cs="Times New Roman"/>
           <w:sz w:val="44"/>
           <w:szCs w:val="44"/>
         </w:rPr>
       </w:pPr>
       <w:r>
         <w:rPr>
+          <w:rFonts w:ascii="Times New Roman" w:hAnsi="Times New Roman" w:cs="Times New Roman"/>
           <w:sz w:val="44"/>
           <w:szCs w:val="44"/>
         </w:rPr>
@@ -273,12 +275,14 @@
       <w:pPr>
         <w:pStyle w:val="Heading1"/>
         <w:rPr>
+          <w:rFonts w:ascii="Times New Roman" w:hAnsi="Times New Roman" w:cs="Times New Roman"/>
           <w:sz w:val="44"/>
           <w:szCs w:val="44"/>
         </w:rPr>
       </w:pPr>
       <w:r>
         <w:rPr>
+          <w:rFonts w:ascii="Times New Roman" w:hAnsi="Times New Roman" w:cs="Times New Roman"/>
           <w:sz w:val="44"/>
           <w:szCs w:val="44"/>
         </w:rPr>
@@ -467,6 +471,137 @@
         <w:t>Task 3</w:t>
       </w:r>
     </w:p>
+    <w:p/>
+    <w:p>
+      <w:pPr>
+        <w:pStyle w:val="Heading1"/>
+        <w:rPr>
+          <w:rFonts w:ascii="Times New Roman" w:hAnsi="Times New Roman" w:cs="Times New Roman"/>
+          <w:sz w:val="44"/>
+          <w:szCs w:val="44"/>
+        </w:rPr>
+      </w:pPr>
+      <w:r>
+        <w:rPr>
+          <w:rFonts w:ascii="Times New Roman" w:hAnsi="Times New Roman" w:cs="Times New Roman"/>
+          <w:sz w:val="44"/>
+          <w:szCs w:val="44"/>
+        </w:rPr>
+        <w:t>Part A – Coding Practice</w:t>
+      </w:r>
+    </w:p>
+    <w:p/>
+    <w:p>
+      <w:pPr>
+        <w:pStyle w:val="NormalWeb"/>
+        <w:rPr>
+          <w:sz w:val="36"/>
+          <w:szCs w:val="36"/>
+        </w:rPr>
+      </w:pPr>
+      <w:r>
+        <w:rPr>
+          <w:sz w:val="36"/>
+          <w:szCs w:val="36"/>
+        </w:rPr>
+        <w:t>F</w:t>
+      </w:r>
+      <w:r>
+        <w:rPr>
+          <w:sz w:val="36"/>
+          <w:szCs w:val="36"/>
+        </w:rPr>
+        <w:t xml:space="preserve">or Part A, I used </w:t>
+      </w:r>
+      <w:proofErr w:type="spellStart"/>
+      <w:r>
+        <w:rPr>
+          <w:sz w:val="36"/>
+          <w:szCs w:val="36"/>
+        </w:rPr>
+        <w:t>HackerRank</w:t>
+      </w:r>
+      <w:proofErr w:type="spellEnd"/>
+      <w:r>
+        <w:rPr>
+          <w:sz w:val="36"/>
+          <w:szCs w:val="36"/>
+        </w:rPr>
+        <w:t xml:space="preserve"> to solve a beginner-level problem called “Solve Me First.” This helped me understand how to take input, process it, and display output correctly in a coding environment. It was a simple problem but it gave me confidence in using the platform and understanding how programming challenges are structured. It also made me realize the importance of logic and accuracy in even basic problems.</w:t>
+      </w:r>
+    </w:p>
+    <w:p>
+      <w:pPr>
+        <w:pStyle w:val="NormalWeb"/>
+        <w:rPr>
+          <w:sz w:val="36"/>
+          <w:szCs w:val="36"/>
+        </w:rPr>
+      </w:pPr>
+      <w:r>
+        <w:rPr>
+          <w:sz w:val="36"/>
+          <w:szCs w:val="36"/>
+        </w:rPr>
+        <w:t>For Part B, I created a Google Form as a Digital Literacy Awareness Quiz consisting of five questions. I included multiple-choice and short answer questions to make it interactive and useful for my classmates. I also viewed the responses in Google Sheets, which helped me understand how data is collected and organized automatically</w:t>
+      </w:r>
+      <w:r>
+        <w:rPr>
+          <w:sz w:val="36"/>
+          <w:szCs w:val="36"/>
+        </w:rPr>
+        <w:t xml:space="preserve"> in google Sheets</w:t>
+      </w:r>
+      <w:r>
+        <w:rPr>
+          <w:sz w:val="36"/>
+          <w:szCs w:val="36"/>
+        </w:rPr>
+        <w:t>.</w:t>
+      </w:r>
+    </w:p>
+    <w:p>
+      <w:pPr>
+        <w:pStyle w:val="NormalWeb"/>
+        <w:rPr>
+          <w:sz w:val="36"/>
+          <w:szCs w:val="36"/>
+        </w:rPr>
+      </w:pPr>
+      <w:r>
+        <w:rPr>
+          <w:sz w:val="36"/>
+          <w:szCs w:val="36"/>
+        </w:rPr>
+        <w:t xml:space="preserve">These tools will help me academically by improving my coding skills and making collaboration easier. Platforms like </w:t>
+      </w:r>
+      <w:proofErr w:type="spellStart"/>
+      <w:r>
+        <w:rPr>
+          <w:sz w:val="36"/>
+          <w:szCs w:val="36"/>
+        </w:rPr>
+        <w:t>HackerRank</w:t>
+      </w:r>
+      <w:proofErr w:type="spellEnd"/>
+      <w:r>
+        <w:rPr>
+          <w:sz w:val="36"/>
+          <w:szCs w:val="36"/>
+        </w:rPr>
+        <w:t xml:space="preserve"> will strengthen my problem-solving ability, while Google Forms will help me conduct surveys and organize information efficiently during projects and assignments.</w:t>
+      </w:r>
+    </w:p>
+    <w:p>
+      <w:pPr>
+        <w:pStyle w:val="NormalWeb"/>
+        <w:rPr>
+          <w:sz w:val="36"/>
+          <w:szCs w:val="36"/>
+        </w:rPr>
+      </w:pPr>
+    </w:p>
+    <w:p/>
     <w:p/>
     <w:p>
       <w:pPr>

</xml_diff>

<commit_message>
Added Task 4 to the project report
</commit_message>
<xml_diff>
--- a/Project_Report.docx
+++ b/Project_Report.docx
@@ -487,12 +487,172 @@
           <w:sz w:val="44"/>
           <w:szCs w:val="44"/>
         </w:rPr>
-        <w:t>Part A – Coding Practice</w:t>
+        <w:t>Explore Coding &amp; Collaboration Platforms</w:t>
+      </w:r>
+    </w:p>
+    <w:p>
+      <w:pPr>
+        <w:pStyle w:val="NormalWeb"/>
+        <w:rPr>
+          <w:sz w:val="36"/>
+          <w:szCs w:val="36"/>
+        </w:rPr>
+      </w:pPr>
+    </w:p>
+    <w:p>
+      <w:pPr>
+        <w:pStyle w:val="NormalWeb"/>
+        <w:rPr>
+          <w:sz w:val="36"/>
+          <w:szCs w:val="36"/>
+        </w:rPr>
+      </w:pPr>
+      <w:r>
+        <w:rPr>
+          <w:sz w:val="36"/>
+          <w:szCs w:val="36"/>
+        </w:rPr>
+        <w:t xml:space="preserve">For Part A, I used </w:t>
+      </w:r>
+      <w:proofErr w:type="spellStart"/>
+      <w:r>
+        <w:rPr>
+          <w:sz w:val="36"/>
+          <w:szCs w:val="36"/>
+        </w:rPr>
+        <w:t>HackerRank</w:t>
+      </w:r>
+      <w:proofErr w:type="spellEnd"/>
+      <w:r>
+        <w:rPr>
+          <w:sz w:val="36"/>
+          <w:szCs w:val="36"/>
+        </w:rPr>
+        <w:t xml:space="preserve"> to solve a beginner-level problem called “Solve Me First.” This helped me understand how to take input, process it, and display output correctly in a coding environment. It was a simple problem but it gave me confidence in using the platform and understanding how programming challenges are structured. It also made me realize the importance of logic and accuracy in even basic problems.</w:t>
+      </w:r>
+    </w:p>
+    <w:p>
+      <w:pPr>
+        <w:pStyle w:val="NormalWeb"/>
+        <w:rPr>
+          <w:sz w:val="36"/>
+          <w:szCs w:val="36"/>
+        </w:rPr>
+      </w:pPr>
+    </w:p>
+    <w:p>
+      <w:pPr>
+        <w:pStyle w:val="NormalWeb"/>
+        <w:rPr>
+          <w:sz w:val="36"/>
+          <w:szCs w:val="36"/>
+        </w:rPr>
+      </w:pPr>
+      <w:r>
+        <w:rPr>
+          <w:sz w:val="36"/>
+          <w:szCs w:val="36"/>
+        </w:rPr>
+        <w:t>For Part B, I created a Google Form as a Digital Literacy Awareness Quiz consisting of five questions. I included multiple-choice and short answer questions to make it interactive and useful for my classmates. I also viewed the responses in Google Sheets, which helped me understand how data is collected and organized automatically</w:t>
+      </w:r>
+      <w:r>
+        <w:rPr>
+          <w:sz w:val="36"/>
+          <w:szCs w:val="36"/>
+        </w:rPr>
+        <w:t xml:space="preserve"> in google Sheets</w:t>
+      </w:r>
+      <w:r>
+        <w:rPr>
+          <w:sz w:val="36"/>
+          <w:szCs w:val="36"/>
+        </w:rPr>
+        <w:t>.</w:t>
+      </w:r>
+    </w:p>
+    <w:p>
+      <w:pPr>
+        <w:pStyle w:val="NormalWeb"/>
+        <w:rPr>
+          <w:sz w:val="36"/>
+          <w:szCs w:val="36"/>
+        </w:rPr>
+      </w:pPr>
+    </w:p>
+    <w:p>
+      <w:pPr>
+        <w:pStyle w:val="NormalWeb"/>
+        <w:rPr>
+          <w:sz w:val="36"/>
+          <w:szCs w:val="36"/>
+        </w:rPr>
+      </w:pPr>
+      <w:r>
+        <w:rPr>
+          <w:sz w:val="36"/>
+          <w:szCs w:val="36"/>
+        </w:rPr>
+        <w:t xml:space="preserve">These tools will help me academically by improving my coding skills and making collaboration easier. Platforms like </w:t>
+      </w:r>
+      <w:proofErr w:type="spellStart"/>
+      <w:r>
+        <w:rPr>
+          <w:sz w:val="36"/>
+          <w:szCs w:val="36"/>
+        </w:rPr>
+        <w:t>HackerRank</w:t>
+      </w:r>
+      <w:proofErr w:type="spellEnd"/>
+      <w:r>
+        <w:rPr>
+          <w:sz w:val="36"/>
+          <w:szCs w:val="36"/>
+        </w:rPr>
+        <w:t xml:space="preserve"> will strengthen my problem-solving ability, while Google Forms will help me conduct surveys and organize information efficiently during projects and assignments.</w:t>
+      </w:r>
+    </w:p>
+    <w:p>
+      <w:pPr>
+        <w:pStyle w:val="Title"/>
+        <w:jc w:val="center"/>
+        <w:rPr>
+          <w:rFonts w:ascii="Times New Roman" w:hAnsi="Times New Roman" w:cs="Times New Roman"/>
+          <w:sz w:val="72"/>
+          <w:szCs w:val="72"/>
+        </w:rPr>
+      </w:pPr>
+      <w:r>
+        <w:rPr>
+          <w:rFonts w:ascii="Times New Roman" w:hAnsi="Times New Roman" w:cs="Times New Roman"/>
+          <w:sz w:val="72"/>
+          <w:szCs w:val="72"/>
+        </w:rPr>
+        <w:lastRenderedPageBreak/>
+        <w:t>TASK 4</w:t>
       </w:r>
     </w:p>
     <w:p/>
     <w:p>
       <w:pPr>
+        <w:pStyle w:val="Heading1"/>
+        <w:rPr>
+          <w:rFonts w:ascii="Times New Roman" w:hAnsi="Times New Roman" w:cs="Times New Roman"/>
+          <w:sz w:val="44"/>
+          <w:szCs w:val="44"/>
+        </w:rPr>
+      </w:pPr>
+      <w:r>
+        <w:rPr>
+          <w:rFonts w:ascii="Times New Roman" w:hAnsi="Times New Roman" w:cs="Times New Roman"/>
+          <w:sz w:val="44"/>
+          <w:szCs w:val="44"/>
+        </w:rPr>
+        <w:t>Draft a Professional Email &amp; Etiquette Guide</w:t>
+      </w:r>
+    </w:p>
+    <w:p/>
+    <w:p>
+      <w:pPr>
         <w:pStyle w:val="NormalWeb"/>
         <w:rPr>
           <w:sz w:val="36"/>
@@ -504,30 +664,7 @@
           <w:sz w:val="36"/>
           <w:szCs w:val="36"/>
         </w:rPr>
-        <w:t>F</w:t>
-      </w:r>
-      <w:r>
-        <w:rPr>
-          <w:sz w:val="36"/>
-          <w:szCs w:val="36"/>
-        </w:rPr>
-        <w:t xml:space="preserve">or Part A, I used </w:t>
-      </w:r>
-      <w:proofErr w:type="spellStart"/>
-      <w:r>
-        <w:rPr>
-          <w:sz w:val="36"/>
-          <w:szCs w:val="36"/>
-        </w:rPr>
-        <w:t>HackerRank</w:t>
-      </w:r>
-      <w:proofErr w:type="spellEnd"/>
-      <w:r>
-        <w:rPr>
-          <w:sz w:val="36"/>
-          <w:szCs w:val="36"/>
-        </w:rPr>
-        <w:t xml:space="preserve"> to solve a beginner-level problem called “Solve Me First.” This helped me understand how to take input, process it, and display output correctly in a coding environment. It was a simple problem but it gave me confidence in using the platform and understanding how programming challenges are structured. It also made me realize the importance of logic and accuracy in even basic problems.</w:t>
+        <w:t>One situation where poor digital communication can cause a serious problem is when a student sends an unprofessional or unclear email to a professor. For instance, if a student writes an email without a proper subject line, uses overly casual language like “Hey,” or does not clearly explain the purpose of the message, the professor may misunderstand the request or fail to recognize its importance. In some cases, such emails might be ignored or delayed, which can lead to negative consequences such as missing assignment deadlines, not receiving important clarifications, or even losing the chance to request an extension.</w:t>
       </w:r>
     </w:p>
     <w:p>
@@ -538,27 +675,6 @@
           <w:szCs w:val="36"/>
         </w:rPr>
       </w:pPr>
-      <w:r>
-        <w:rPr>
-          <w:sz w:val="36"/>
-          <w:szCs w:val="36"/>
-        </w:rPr>
-        <w:t>For Part B, I created a Google Form as a Digital Literacy Awareness Quiz consisting of five questions. I included multiple-choice and short answer questions to make it interactive and useful for my classmates. I also viewed the responses in Google Sheets, which helped me understand how data is collected and organized automatically</w:t>
-      </w:r>
-      <w:r>
-        <w:rPr>
-          <w:sz w:val="36"/>
-          <w:szCs w:val="36"/>
-        </w:rPr>
-        <w:t xml:space="preserve"> in google Sheets</w:t>
-      </w:r>
-      <w:r>
-        <w:rPr>
-          <w:sz w:val="36"/>
-          <w:szCs w:val="36"/>
-        </w:rPr>
-        <w:t>.</w:t>
-      </w:r>
     </w:p>
     <w:p>
       <w:pPr>
@@ -573,43 +689,10 @@
           <w:sz w:val="36"/>
           <w:szCs w:val="36"/>
         </w:rPr>
-        <w:t xml:space="preserve">These tools will help me academically by improving my coding skills and making collaboration easier. Platforms like </w:t>
-      </w:r>
-      <w:proofErr w:type="spellStart"/>
-      <w:r>
-        <w:rPr>
-          <w:sz w:val="36"/>
-          <w:szCs w:val="36"/>
-        </w:rPr>
-        <w:t>HackerRank</w:t>
-      </w:r>
-      <w:proofErr w:type="spellEnd"/>
-      <w:r>
-        <w:rPr>
-          <w:sz w:val="36"/>
-          <w:szCs w:val="36"/>
-        </w:rPr>
-        <w:t xml:space="preserve"> will strengthen my problem-solving ability, while Google Forms will help me conduct surveys and organize information efficiently during projects and assignments.</w:t>
-      </w:r>
-    </w:p>
-    <w:p>
-      <w:pPr>
-        <w:pStyle w:val="NormalWeb"/>
-        <w:rPr>
-          <w:sz w:val="36"/>
-          <w:szCs w:val="36"/>
-        </w:rPr>
-      </w:pPr>
+        <w:t>This issue could have been avoided by following proper email etiquette. The student should include a clear and relevant subject line that reflects the purpose of the email, use a respectful greeting, and present their message in a structured and polite manner. It is also important to keep the content concise while including all necessary details. Additionally, proofreading the email before sending it can help avoid grammatical errors and improve clarity. Overall, clear and professional digital communication ensures that the message is understood correctly and helps build a positive and respectful impression.</w:t>
+      </w:r>
     </w:p>
     <w:p/>
-    <w:p/>
-    <w:p>
-      <w:pPr>
-        <w:rPr>
-          <w:rFonts w:ascii="Times New Roman" w:hAnsi="Times New Roman" w:cs="Times New Roman"/>
-        </w:rPr>
-      </w:pPr>
-    </w:p>
     <w:p/>
     <w:sectPr>
       <w:pgSz w:w="11906" w:h="16838"/>

</xml_diff>

<commit_message>
Added Task 5 to the project report
</commit_message>
<xml_diff>
--- a/Project_Report.docx
+++ b/Project_Report.docx
@@ -693,6 +693,149 @@
       </w:r>
     </w:p>
     <w:p/>
+    <w:p>
+      <w:pPr>
+        <w:pStyle w:val="Title"/>
+        <w:jc w:val="center"/>
+        <w:rPr>
+          <w:rFonts w:ascii="Times New Roman" w:hAnsi="Times New Roman" w:cs="Times New Roman"/>
+          <w:sz w:val="72"/>
+          <w:szCs w:val="72"/>
+        </w:rPr>
+      </w:pPr>
+      <w:r>
+        <w:rPr>
+          <w:rFonts w:ascii="Times New Roman" w:hAnsi="Times New Roman" w:cs="Times New Roman"/>
+          <w:sz w:val="72"/>
+          <w:szCs w:val="72"/>
+        </w:rPr>
+        <w:lastRenderedPageBreak/>
+        <w:t>Task 5</w:t>
+      </w:r>
+    </w:p>
+    <w:p/>
+    <w:p>
+      <w:pPr>
+        <w:pStyle w:val="Heading1"/>
+        <w:rPr>
+          <w:rFonts w:ascii="Times New Roman" w:hAnsi="Times New Roman" w:cs="Times New Roman"/>
+          <w:sz w:val="44"/>
+          <w:szCs w:val="44"/>
+        </w:rPr>
+      </w:pPr>
+      <w:r>
+        <w:rPr>
+          <w:rFonts w:ascii="Times New Roman" w:hAnsi="Times New Roman" w:cs="Times New Roman"/>
+          <w:sz w:val="44"/>
+          <w:szCs w:val="44"/>
+        </w:rPr>
+        <w:t>Cybercrime Awareness Case Study &amp; Prevention Guide</w:t>
+      </w:r>
+    </w:p>
+    <w:p/>
+    <w:p>
+      <w:pPr>
+        <w:pStyle w:val="NormalWeb"/>
+        <w:rPr>
+          <w:sz w:val="36"/>
+          <w:szCs w:val="36"/>
+        </w:rPr>
+      </w:pPr>
+      <w:r>
+        <w:rPr>
+          <w:sz w:val="36"/>
+          <w:szCs w:val="36"/>
+        </w:rPr>
+        <w:t>While researching and creating the</w:t>
+      </w:r>
+      <w:r>
+        <w:rPr>
+          <w:sz w:val="36"/>
+          <w:szCs w:val="36"/>
+        </w:rPr>
+        <w:t xml:space="preserve"> </w:t>
+      </w:r>
+      <w:r>
+        <w:rPr>
+          <w:sz w:val="36"/>
+          <w:szCs w:val="36"/>
+        </w:rPr>
+        <w:t>Stay Safe Online</w:t>
+      </w:r>
+      <w:r>
+        <w:rPr>
+          <w:sz w:val="36"/>
+          <w:szCs w:val="36"/>
+        </w:rPr>
+        <w:t xml:space="preserve"> </w:t>
+      </w:r>
+      <w:r>
+        <w:rPr>
+          <w:sz w:val="36"/>
+          <w:szCs w:val="36"/>
+        </w:rPr>
+        <w:t>prevention checklist what surprised me the most was how many common online habits can actually lead to serious security risks. I realized that many students including myself</w:t>
+      </w:r>
+      <w:r>
+        <w:rPr>
+          <w:sz w:val="36"/>
+          <w:szCs w:val="36"/>
+        </w:rPr>
+        <w:t xml:space="preserve"> </w:t>
+      </w:r>
+      <w:r>
+        <w:rPr>
+          <w:sz w:val="36"/>
+          <w:szCs w:val="36"/>
+        </w:rPr>
+        <w:t>often overlook basic precautions like checking website authenticity or ignoring suspicious links. I was also surprised to learn how frequently financial fraud happens through UPI especially when people unknowingly approve payment requests or share sensitive information like OTPs</w:t>
+      </w:r>
+      <w:r>
+        <w:rPr>
+          <w:sz w:val="36"/>
+          <w:szCs w:val="36"/>
+        </w:rPr>
+        <w:t>,</w:t>
+      </w:r>
+      <w:r>
+        <w:rPr>
+          <w:sz w:val="36"/>
+          <w:szCs w:val="36"/>
+        </w:rPr>
+        <w:t xml:space="preserve"> </w:t>
+      </w:r>
+      <w:proofErr w:type="gramStart"/>
+      <w:r>
+        <w:rPr>
+          <w:sz w:val="36"/>
+          <w:szCs w:val="36"/>
+        </w:rPr>
+        <w:t>These</w:t>
+      </w:r>
+      <w:proofErr w:type="gramEnd"/>
+      <w:r>
+        <w:rPr>
+          <w:sz w:val="36"/>
+          <w:szCs w:val="36"/>
+        </w:rPr>
+        <w:t xml:space="preserve"> small mistakes can lead to significant financial and personal loss.</w:t>
+      </w:r>
+    </w:p>
+    <w:p>
+      <w:pPr>
+        <w:pStyle w:val="NormalWeb"/>
+      </w:pPr>
+      <w:r>
+        <w:rPr>
+          <w:sz w:val="36"/>
+          <w:szCs w:val="36"/>
+        </w:rPr>
+        <w:t>As a result of this research, one habit I will personally change is being more cautious while handling online transactions and messages. I will make it a point to always verify payment requests and avoid clicking on unknown links. Additionally, I will enable stronger security measures like two-factor authentication on my accounts. This activity has helped me understand the importance of being alert and responsible online, and I will apply these practices in my daily digital interactions</w:t>
+      </w:r>
+      <w:r>
+        <w:t>.</w:t>
+      </w:r>
+    </w:p>
     <w:p/>
     <w:sectPr>
       <w:pgSz w:w="11906" w:h="16838"/>

</xml_diff>

<commit_message>
Modified the project report and finalized it
</commit_message>
<xml_diff>
--- a/Project_Report.docx
+++ b/Project_Report.docx
@@ -8,6 +8,300 @@
         <w:jc w:val="center"/>
         <w:rPr>
           <w:rFonts w:ascii="Times New Roman" w:hAnsi="Times New Roman" w:cs="Times New Roman"/>
+          <w:b/>
+          <w:bCs/>
+          <w:sz w:val="24"/>
+          <w:szCs w:val="24"/>
+        </w:rPr>
+      </w:pPr>
+      <w:r>
+        <w:rPr>
+          <w:rFonts w:ascii="Times New Roman" w:hAnsi="Times New Roman" w:cs="Times New Roman"/>
+          <w:b/>
+          <w:bCs/>
+          <w:sz w:val="24"/>
+          <w:szCs w:val="24"/>
+        </w:rPr>
+        <w:t>Digital Literacy</w:t>
+      </w:r>
+    </w:p>
+    <w:p/>
+    <w:p/>
+    <w:p/>
+    <w:p/>
+    <w:p/>
+    <w:p>
+      <w:pPr>
+        <w:rPr>
+          <w:rFonts w:ascii="Times New Roman" w:hAnsi="Times New Roman" w:cs="Times New Roman"/>
+        </w:rPr>
+      </w:pPr>
+      <w:proofErr w:type="gramStart"/>
+      <w:r>
+        <w:rPr>
+          <w:b/>
+          <w:bCs/>
+        </w:rPr>
+        <w:t>Name</w:t>
+      </w:r>
+      <w:r>
+        <w:rPr>
+          <w:rFonts w:ascii="Times New Roman" w:hAnsi="Times New Roman" w:cs="Times New Roman"/>
+        </w:rPr>
+        <w:t>:-</w:t>
+      </w:r>
+      <w:proofErr w:type="gramEnd"/>
+      <w:r>
+        <w:rPr>
+          <w:rFonts w:ascii="Times New Roman" w:hAnsi="Times New Roman" w:cs="Times New Roman"/>
+        </w:rPr>
+        <w:t xml:space="preserve"> Pushkara Bhardwaj</w:t>
+      </w:r>
+    </w:p>
+    <w:p>
+      <w:pPr>
+        <w:rPr>
+          <w:rFonts w:ascii="Times New Roman" w:hAnsi="Times New Roman" w:cs="Times New Roman"/>
+        </w:rPr>
+      </w:pPr>
+      <w:r>
+        <w:rPr>
+          <w:rFonts w:ascii="Times New Roman" w:hAnsi="Times New Roman" w:cs="Times New Roman"/>
+          <w:b/>
+          <w:bCs/>
+        </w:rPr>
+        <w:t xml:space="preserve">Registration </w:t>
+      </w:r>
+      <w:proofErr w:type="gramStart"/>
+      <w:r>
+        <w:rPr>
+          <w:rFonts w:ascii="Times New Roman" w:hAnsi="Times New Roman" w:cs="Times New Roman"/>
+          <w:b/>
+          <w:bCs/>
+        </w:rPr>
+        <w:t>no</w:t>
+      </w:r>
+      <w:r>
+        <w:rPr>
+          <w:rFonts w:ascii="Times New Roman" w:hAnsi="Times New Roman" w:cs="Times New Roman"/>
+        </w:rPr>
+        <w:t>:-</w:t>
+      </w:r>
+      <w:proofErr w:type="gramEnd"/>
+      <w:r>
+        <w:rPr>
+          <w:rFonts w:ascii="Times New Roman" w:hAnsi="Times New Roman" w:cs="Times New Roman"/>
+        </w:rPr>
+        <w:t xml:space="preserve"> 25BCY10105</w:t>
+      </w:r>
+    </w:p>
+    <w:p>
+      <w:pPr>
+        <w:rPr>
+          <w:rFonts w:ascii="Times New Roman" w:hAnsi="Times New Roman" w:cs="Times New Roman"/>
+        </w:rPr>
+      </w:pPr>
+      <w:proofErr w:type="gramStart"/>
+      <w:r>
+        <w:rPr>
+          <w:rFonts w:ascii="Times New Roman" w:hAnsi="Times New Roman" w:cs="Times New Roman"/>
+          <w:b/>
+          <w:bCs/>
+        </w:rPr>
+        <w:t>Branch</w:t>
+      </w:r>
+      <w:r>
+        <w:rPr>
+          <w:rFonts w:ascii="Times New Roman" w:hAnsi="Times New Roman" w:cs="Times New Roman"/>
+        </w:rPr>
+        <w:t>:-</w:t>
+      </w:r>
+      <w:proofErr w:type="gramEnd"/>
+      <w:r>
+        <w:rPr>
+          <w:rFonts w:ascii="OpenSans" w:hAnsi="OpenSans"/>
+          <w:b/>
+          <w:bCs/>
+          <w:color w:val="212529"/>
+          <w:sz w:val="21"/>
+          <w:szCs w:val="21"/>
+          <w:shd w:val="clear" w:color="auto" w:fill="FFFFFF"/>
+        </w:rPr>
+        <w:t xml:space="preserve"> </w:t>
+      </w:r>
+      <w:r>
+        <w:rPr>
+          <w:rFonts w:ascii="Times New Roman" w:hAnsi="Times New Roman" w:cs="Times New Roman"/>
+          <w:b/>
+          <w:bCs/>
+        </w:rPr>
+        <w:t> </w:t>
+      </w:r>
+      <w:r>
+        <w:rPr>
+          <w:rFonts w:ascii="Times New Roman" w:hAnsi="Times New Roman" w:cs="Times New Roman"/>
+        </w:rPr>
+        <w:t>Computer Science and Engineering (Cyber Security and Digital Forensics)</w:t>
+      </w:r>
+    </w:p>
+    <w:p>
+      <w:pPr>
+        <w:rPr>
+          <w:rFonts w:ascii="Times New Roman" w:hAnsi="Times New Roman" w:cs="Times New Roman"/>
+        </w:rPr>
+      </w:pPr>
+      <w:proofErr w:type="gramStart"/>
+      <w:r>
+        <w:rPr>
+          <w:rFonts w:ascii="Times New Roman" w:hAnsi="Times New Roman" w:cs="Times New Roman"/>
+          <w:b/>
+          <w:bCs/>
+        </w:rPr>
+        <w:t>Year</w:t>
+      </w:r>
+      <w:r>
+        <w:rPr>
+          <w:rFonts w:ascii="Times New Roman" w:hAnsi="Times New Roman" w:cs="Times New Roman"/>
+        </w:rPr>
+        <w:t>:-</w:t>
+      </w:r>
+      <w:proofErr w:type="gramEnd"/>
+      <w:r>
+        <w:rPr>
+          <w:rFonts w:ascii="Times New Roman" w:hAnsi="Times New Roman" w:cs="Times New Roman"/>
+        </w:rPr>
+        <w:t>2025-2029</w:t>
+      </w:r>
+    </w:p>
+    <w:p>
+      <w:pPr>
+        <w:rPr>
+          <w:rFonts w:ascii="Times New Roman" w:hAnsi="Times New Roman" w:cs="Times New Roman"/>
+        </w:rPr>
+      </w:pPr>
+      <w:r>
+        <w:rPr>
+          <w:rFonts w:ascii="Times New Roman" w:hAnsi="Times New Roman" w:cs="Times New Roman"/>
+          <w:b/>
+          <w:bCs/>
+        </w:rPr>
+        <w:t xml:space="preserve">Course </w:t>
+      </w:r>
+      <w:proofErr w:type="gramStart"/>
+      <w:r>
+        <w:rPr>
+          <w:rFonts w:ascii="Times New Roman" w:hAnsi="Times New Roman" w:cs="Times New Roman"/>
+          <w:b/>
+          <w:bCs/>
+        </w:rPr>
+        <w:t>code</w:t>
+      </w:r>
+      <w:r>
+        <w:rPr>
+          <w:rFonts w:ascii="Times New Roman" w:hAnsi="Times New Roman" w:cs="Times New Roman"/>
+          <w:b/>
+          <w:bCs/>
+        </w:rPr>
+        <w:t>:-</w:t>
+      </w:r>
+      <w:proofErr w:type="gramEnd"/>
+      <w:r>
+        <w:rPr>
+          <w:rFonts w:ascii="Times New Roman" w:hAnsi="Times New Roman" w:cs="Times New Roman"/>
+          <w:b/>
+          <w:bCs/>
+        </w:rPr>
+        <w:t xml:space="preserve"> </w:t>
+      </w:r>
+      <w:r>
+        <w:rPr>
+          <w:rFonts w:ascii="Times New Roman" w:hAnsi="Times New Roman" w:cs="Times New Roman"/>
+        </w:rPr>
+        <w:t>CSE0001</w:t>
+      </w:r>
+    </w:p>
+    <w:p>
+      <w:pPr>
+        <w:rPr>
+          <w:rFonts w:ascii="Times New Roman" w:hAnsi="Times New Roman" w:cs="Times New Roman"/>
+        </w:rPr>
+      </w:pPr>
+      <w:proofErr w:type="gramStart"/>
+      <w:r>
+        <w:rPr>
+          <w:rFonts w:ascii="Times New Roman" w:hAnsi="Times New Roman" w:cs="Times New Roman"/>
+          <w:b/>
+          <w:bCs/>
+        </w:rPr>
+        <w:t>Date</w:t>
+      </w:r>
+      <w:r>
+        <w:rPr>
+          <w:rFonts w:ascii="Times New Roman" w:hAnsi="Times New Roman" w:cs="Times New Roman"/>
+        </w:rPr>
+        <w:t>:-</w:t>
+      </w:r>
+      <w:proofErr w:type="gramEnd"/>
+      <w:r>
+        <w:rPr>
+          <w:rFonts w:ascii="Times New Roman" w:hAnsi="Times New Roman" w:cs="Times New Roman"/>
+        </w:rPr>
+        <w:t xml:space="preserve"> 25/03/2026</w:t>
+      </w:r>
+    </w:p>
+    <w:p>
+      <w:pPr>
+        <w:rPr>
+          <w:rFonts w:ascii="Times New Roman" w:hAnsi="Times New Roman" w:cs="Times New Roman"/>
+        </w:rPr>
+      </w:pPr>
+    </w:p>
+    <w:p>
+      <w:pPr>
+        <w:rPr>
+          <w:rFonts w:ascii="Times New Roman" w:hAnsi="Times New Roman" w:cs="Times New Roman"/>
+          <w:b/>
+          <w:bCs/>
+        </w:rPr>
+      </w:pPr>
+    </w:p>
+    <w:p>
+      <w:pPr>
+        <w:rPr>
+          <w:rFonts w:ascii="Times New Roman" w:hAnsi="Times New Roman" w:cs="Times New Roman"/>
+        </w:rPr>
+      </w:pPr>
+    </w:p>
+    <w:p>
+      <w:pPr>
+        <w:rPr>
+          <w:rFonts w:ascii="Times New Roman" w:hAnsi="Times New Roman" w:cs="Times New Roman"/>
+        </w:rPr>
+      </w:pPr>
+    </w:p>
+    <w:p>
+      <w:pPr>
+        <w:rPr>
+          <w:rFonts w:ascii="Times New Roman" w:hAnsi="Times New Roman" w:cs="Times New Roman"/>
+        </w:rPr>
+      </w:pPr>
+    </w:p>
+    <w:p>
+      <w:pPr>
+        <w:rPr>
+          <w:rFonts w:ascii="Times New Roman" w:hAnsi="Times New Roman" w:cs="Times New Roman"/>
+        </w:rPr>
+      </w:pPr>
+    </w:p>
+    <w:p/>
+    <w:p/>
+    <w:p/>
+    <w:p>
+      <w:pPr>
+        <w:rPr>
+          <w:rFonts w:ascii="Times New Roman" w:eastAsiaTheme="majorEastAsia" w:hAnsi="Times New Roman" w:cs="Times New Roman"/>
+          <w:spacing w:val="-10"/>
+          <w:kern w:val="28"/>
           <w:sz w:val="72"/>
           <w:szCs w:val="72"/>
         </w:rPr>
@@ -18,7 +312,159 @@
           <w:sz w:val="72"/>
           <w:szCs w:val="72"/>
         </w:rPr>
-        <w:t>Task 1</w:t>
+        <w:br w:type="page"/>
+      </w:r>
+    </w:p>
+    <w:p>
+      <w:pPr>
+        <w:pStyle w:val="Title"/>
+        <w:jc w:val="center"/>
+        <w:rPr>
+          <w:rFonts w:ascii="Times New Roman" w:hAnsi="Times New Roman" w:cs="Times New Roman"/>
+          <w:b/>
+          <w:bCs/>
+          <w:sz w:val="24"/>
+          <w:szCs w:val="24"/>
+        </w:rPr>
+      </w:pPr>
+      <w:r>
+        <w:rPr>
+          <w:rFonts w:ascii="Times New Roman" w:hAnsi="Times New Roman" w:cs="Times New Roman"/>
+          <w:b/>
+          <w:bCs/>
+          <w:sz w:val="24"/>
+          <w:szCs w:val="24"/>
+        </w:rPr>
+        <w:lastRenderedPageBreak/>
+        <w:t>Introduction</w:t>
+      </w:r>
+    </w:p>
+    <w:p/>
+    <w:p>
+      <w:pPr>
+        <w:pStyle w:val="NormalWeb"/>
+      </w:pPr>
+      <w:r>
+        <w:t xml:space="preserve">This project was done as part of the Digital Literacy course to understand the importance of digital skills in today’s world. As a Student Digital Ambassador, the main aim was to explore different areas of digital literacy and how they are useful for students. The project includes five tasks, each focusing on a different topic. First, I created an infographic to explain what digital literacy is and why it matters. Then I worked on building a digital portfolio using platforms like GitHub and LinkedIn, which was new for me. After that, I explored coding and collaboration tools, which helped me understand how these platforms actually work in real life. I also wrote professional emails and made a checklist for proper online </w:t>
+      </w:r>
+      <w:proofErr w:type="spellStart"/>
+      <w:r>
+        <w:t>behavior</w:t>
+      </w:r>
+      <w:proofErr w:type="spellEnd"/>
+      <w:r>
+        <w:t>. Lastly, I did a case study on cybercrime and created a prevention checklist. Overall, this project helped me learn many useful things, although some parts was a bit challenging at first.</w:t>
+      </w:r>
+    </w:p>
+    <w:p>
+      <w:pPr>
+        <w:pStyle w:val="Title"/>
+        <w:jc w:val="center"/>
+        <w:rPr>
+          <w:rFonts w:ascii="Times New Roman" w:hAnsi="Times New Roman" w:cs="Times New Roman"/>
+          <w:sz w:val="24"/>
+          <w:szCs w:val="24"/>
+        </w:rPr>
+      </w:pPr>
+    </w:p>
+    <w:p>
+      <w:pPr>
+        <w:pStyle w:val="Title"/>
+        <w:rPr>
+          <w:rFonts w:ascii="Times New Roman" w:hAnsi="Times New Roman" w:cs="Times New Roman"/>
+          <w:sz w:val="24"/>
+          <w:szCs w:val="24"/>
+        </w:rPr>
+      </w:pPr>
+    </w:p>
+    <w:p>
+      <w:pPr>
+        <w:pStyle w:val="Title"/>
+        <w:jc w:val="center"/>
+        <w:rPr>
+          <w:rFonts w:ascii="Times New Roman" w:hAnsi="Times New Roman" w:cs="Times New Roman"/>
+          <w:sz w:val="24"/>
+          <w:szCs w:val="24"/>
+        </w:rPr>
+      </w:pPr>
+    </w:p>
+    <w:p>
+      <w:pPr>
+        <w:pStyle w:val="Title"/>
+        <w:jc w:val="center"/>
+        <w:rPr>
+          <w:rFonts w:ascii="Times New Roman" w:hAnsi="Times New Roman" w:cs="Times New Roman"/>
+          <w:sz w:val="24"/>
+          <w:szCs w:val="24"/>
+        </w:rPr>
+      </w:pPr>
+    </w:p>
+    <w:p>
+      <w:pPr>
+        <w:pStyle w:val="Title"/>
+        <w:jc w:val="center"/>
+        <w:rPr>
+          <w:rFonts w:ascii="Times New Roman" w:hAnsi="Times New Roman" w:cs="Times New Roman"/>
+          <w:sz w:val="24"/>
+          <w:szCs w:val="24"/>
+        </w:rPr>
+      </w:pPr>
+    </w:p>
+    <w:p>
+      <w:pPr>
+        <w:pStyle w:val="Title"/>
+        <w:jc w:val="center"/>
+        <w:rPr>
+          <w:rFonts w:ascii="Times New Roman" w:hAnsi="Times New Roman" w:cs="Times New Roman"/>
+          <w:sz w:val="24"/>
+          <w:szCs w:val="24"/>
+        </w:rPr>
+      </w:pPr>
+    </w:p>
+    <w:p>
+      <w:pPr>
+        <w:pStyle w:val="Title"/>
+        <w:jc w:val="center"/>
+        <w:rPr>
+          <w:rFonts w:ascii="Times New Roman" w:hAnsi="Times New Roman" w:cs="Times New Roman"/>
+          <w:sz w:val="24"/>
+          <w:szCs w:val="24"/>
+        </w:rPr>
+      </w:pPr>
+    </w:p>
+    <w:p>
+      <w:pPr>
+        <w:pStyle w:val="Title"/>
+        <w:jc w:val="center"/>
+        <w:rPr>
+          <w:rFonts w:ascii="Times New Roman" w:hAnsi="Times New Roman" w:cs="Times New Roman"/>
+          <w:sz w:val="24"/>
+          <w:szCs w:val="24"/>
+        </w:rPr>
+      </w:pPr>
+      <w:r>
+        <w:rPr>
+          <w:rFonts w:ascii="Times New Roman" w:hAnsi="Times New Roman" w:cs="Times New Roman"/>
+          <w:sz w:val="24"/>
+          <w:szCs w:val="24"/>
+        </w:rPr>
+        <w:t>T</w:t>
+      </w:r>
+      <w:r>
+        <w:rPr>
+          <w:rFonts w:ascii="Times New Roman" w:hAnsi="Times New Roman" w:cs="Times New Roman"/>
+          <w:sz w:val="24"/>
+          <w:szCs w:val="24"/>
+        </w:rPr>
+        <w:t>ASK</w:t>
+      </w:r>
+      <w:r>
+        <w:rPr>
+          <w:rFonts w:ascii="Times New Roman" w:hAnsi="Times New Roman" w:cs="Times New Roman"/>
+          <w:sz w:val="24"/>
+          <w:szCs w:val="24"/>
+        </w:rPr>
+        <w:t xml:space="preserve"> 1</w:t>
       </w:r>
     </w:p>
     <w:p>
@@ -26,15 +472,15 @@
         <w:pStyle w:val="Heading1"/>
         <w:rPr>
           <w:rFonts w:ascii="Times New Roman" w:hAnsi="Times New Roman" w:cs="Times New Roman"/>
-          <w:sz w:val="44"/>
-          <w:szCs w:val="44"/>
-        </w:rPr>
-      </w:pPr>
-      <w:r>
-        <w:rPr>
-          <w:rFonts w:ascii="Times New Roman" w:hAnsi="Times New Roman" w:cs="Times New Roman"/>
-          <w:sz w:val="44"/>
-          <w:szCs w:val="44"/>
+          <w:sz w:val="24"/>
+          <w:szCs w:val="24"/>
+        </w:rPr>
+      </w:pPr>
+      <w:r>
+        <w:rPr>
+          <w:rFonts w:ascii="Times New Roman" w:hAnsi="Times New Roman" w:cs="Times New Roman"/>
+          <w:sz w:val="24"/>
+          <w:szCs w:val="24"/>
         </w:rPr>
         <w:t>Create a Digital Literacy Awareness Infographic</w:t>
       </w:r>
@@ -43,88 +489,48 @@
     <w:p>
       <w:pPr>
         <w:pStyle w:val="NormalWeb"/>
-        <w:rPr>
-          <w:sz w:val="36"/>
-          <w:szCs w:val="36"/>
-        </w:rPr>
-      </w:pPr>
-      <w:r>
-        <w:rPr>
-          <w:sz w:val="36"/>
-          <w:szCs w:val="36"/>
-        </w:rPr>
+      </w:pPr>
+      <w:r>
         <w:t xml:space="preserve">I created my infographic using </w:t>
       </w:r>
       <w:r>
         <w:rPr>
           <w:rStyle w:val="whitespace-normal"/>
           <w:rFonts w:eastAsiaTheme="majorEastAsia"/>
-          <w:sz w:val="36"/>
-          <w:szCs w:val="36"/>
         </w:rPr>
         <w:t>Canva</w:t>
       </w:r>
       <w:r>
-        <w:rPr>
-          <w:sz w:val="36"/>
-          <w:szCs w:val="36"/>
-        </w:rPr>
         <w:t xml:space="preserve">, which is an </w:t>
       </w:r>
       <w:proofErr w:type="gramStart"/>
       <w:r>
-        <w:rPr>
-          <w:sz w:val="36"/>
-          <w:szCs w:val="36"/>
-        </w:rPr>
         <w:t>easy to use</w:t>
       </w:r>
       <w:proofErr w:type="gramEnd"/>
       <w:r>
-        <w:rPr>
-          <w:sz w:val="36"/>
-          <w:szCs w:val="36"/>
-        </w:rPr>
         <w:t xml:space="preserve"> online design tool with many ready to use templates and visual elements. I selected a Landscape infographic template and customized it according to my topic</w:t>
       </w:r>
     </w:p>
     <w:p>
       <w:pPr>
         <w:pStyle w:val="NormalWeb"/>
-        <w:rPr>
-          <w:sz w:val="36"/>
-          <w:szCs w:val="36"/>
-        </w:rPr>
-      </w:pPr>
-      <w:r>
-        <w:rPr>
-          <w:sz w:val="36"/>
-          <w:szCs w:val="36"/>
-        </w:rPr>
+      </w:pPr>
+      <w:r>
         <w:t xml:space="preserve">The topics </w:t>
       </w:r>
       <w:proofErr w:type="spellStart"/>
       <w:r>
-        <w:rPr>
-          <w:sz w:val="36"/>
-          <w:szCs w:val="36"/>
-        </w:rPr>
         <w:t>i</w:t>
       </w:r>
       <w:proofErr w:type="spellEnd"/>
       <w:r>
-        <w:rPr>
-          <w:sz w:val="36"/>
-          <w:szCs w:val="36"/>
-        </w:rPr>
         <w:t xml:space="preserve"> chose were </w:t>
       </w:r>
       <w:r>
         <w:rPr>
           <w:b/>
           <w:bCs/>
-          <w:sz w:val="36"/>
-          <w:szCs w:val="36"/>
         </w:rPr>
         <w:t>What digital literacy is,</w:t>
       </w:r>
@@ -132,8 +538,6 @@
         <w:rPr>
           <w:rFonts w:asciiTheme="minorHAnsi" w:eastAsiaTheme="minorHAnsi" w:hAnsiTheme="minorHAnsi" w:cstheme="minorBidi"/>
           <w:kern w:val="2"/>
-          <w:sz w:val="36"/>
-          <w:szCs w:val="36"/>
           <w:lang w:eastAsia="en-US"/>
           <w14:ligatures w14:val="standardContextual"/>
         </w:rPr>
@@ -143,8 +547,6 @@
         <w:rPr>
           <w:b/>
           <w:bCs/>
-          <w:sz w:val="36"/>
-          <w:szCs w:val="36"/>
         </w:rPr>
         <w:t>Useful digital tools for students,</w:t>
       </w:r>
@@ -152,8 +554,6 @@
         <w:rPr>
           <w:rFonts w:asciiTheme="minorHAnsi" w:eastAsiaTheme="minorHAnsi" w:hAnsiTheme="minorHAnsi" w:cstheme="minorBidi"/>
           <w:kern w:val="2"/>
-          <w:sz w:val="36"/>
-          <w:szCs w:val="36"/>
           <w:lang w:eastAsia="en-US"/>
           <w14:ligatures w14:val="standardContextual"/>
         </w:rPr>
@@ -163,8 +563,6 @@
         <w:rPr>
           <w:b/>
           <w:bCs/>
-          <w:sz w:val="36"/>
-          <w:szCs w:val="36"/>
         </w:rPr>
         <w:t>Email etiquette</w:t>
       </w:r>
@@ -172,62 +570,30 @@
     <w:p>
       <w:pPr>
         <w:pStyle w:val="NormalWeb"/>
-        <w:rPr>
-          <w:sz w:val="36"/>
-          <w:szCs w:val="36"/>
-        </w:rPr>
-      </w:pPr>
-      <w:r>
-        <w:rPr>
-          <w:sz w:val="36"/>
-          <w:szCs w:val="36"/>
-        </w:rPr>
+      </w:pPr>
+      <w:r>
         <w:t xml:space="preserve">I explained the basic concept of digital literacy and its importance in today’s world. The second section highlights commonly used tools like document editors, note-taking apps, and communication platforms that help students improve productivity. The third section focuses on proper email etiquette, including writing clear subject lines, using polite language, and maintaining a professional tone. I also used icons and a consistent </w:t>
       </w:r>
       <w:proofErr w:type="spellStart"/>
       <w:r>
-        <w:rPr>
-          <w:sz w:val="36"/>
-          <w:szCs w:val="36"/>
-        </w:rPr>
         <w:t>color</w:t>
       </w:r>
       <w:proofErr w:type="spellEnd"/>
       <w:r>
-        <w:rPr>
-          <w:sz w:val="36"/>
-          <w:szCs w:val="36"/>
-        </w:rPr>
         <w:t xml:space="preserve"> scheme to make the infographic visually appealing and easy to understand.</w:t>
       </w:r>
     </w:p>
     <w:p>
       <w:pPr>
         <w:pStyle w:val="NormalWeb"/>
-        <w:rPr>
-          <w:sz w:val="28"/>
-          <w:szCs w:val="28"/>
-        </w:rPr>
-      </w:pPr>
-      <w:r>
-        <w:rPr>
-          <w:sz w:val="36"/>
-          <w:szCs w:val="36"/>
-        </w:rPr>
+      </w:pPr>
+      <w:r>
         <w:t>One thing I found challenging was organizing the information in a concise way without making the design look crowded</w:t>
       </w:r>
       <w:r>
-        <w:rPr>
-          <w:sz w:val="36"/>
-          <w:szCs w:val="36"/>
-        </w:rPr>
         <w:t xml:space="preserve"> also finding the right imagery to represent the data was tough so that took a lot time</w:t>
       </w:r>
       <w:r>
-        <w:rPr>
-          <w:sz w:val="36"/>
-          <w:szCs w:val="36"/>
-        </w:rPr>
         <w:t>. However, I found it interesting to balance visuals and text to create an engaging and informative infographic.</w:t>
       </w:r>
     </w:p>
@@ -241,11 +607,15 @@
         <w:pStyle w:val="Title"/>
         <w:rPr>
           <w:rFonts w:ascii="Times New Roman" w:hAnsi="Times New Roman" w:cs="Times New Roman"/>
-        </w:rPr>
-      </w:pPr>
-      <w:r>
-        <w:rPr>
-          <w:rFonts w:ascii="Times New Roman" w:hAnsi="Times New Roman" w:cs="Times New Roman"/>
+          <w:sz w:val="24"/>
+          <w:szCs w:val="24"/>
+        </w:rPr>
+      </w:pPr>
+      <w:r>
+        <w:rPr>
+          <w:rFonts w:ascii="Times New Roman" w:hAnsi="Times New Roman" w:cs="Times New Roman"/>
+          <w:sz w:val="24"/>
+          <w:szCs w:val="24"/>
         </w:rPr>
         <w:t xml:space="preserve">      </w:t>
       </w:r>
@@ -256,18 +626,34 @@
         <w:jc w:val="center"/>
         <w:rPr>
           <w:rFonts w:ascii="Times New Roman" w:hAnsi="Times New Roman" w:cs="Times New Roman"/>
-          <w:sz w:val="72"/>
-          <w:szCs w:val="72"/>
-        </w:rPr>
-      </w:pPr>
-      <w:r>
-        <w:rPr>
-          <w:rFonts w:ascii="Times New Roman" w:hAnsi="Times New Roman" w:cs="Times New Roman"/>
-          <w:sz w:val="72"/>
-          <w:szCs w:val="72"/>
+          <w:sz w:val="24"/>
+          <w:szCs w:val="24"/>
+        </w:rPr>
+      </w:pPr>
+      <w:r>
+        <w:rPr>
+          <w:rFonts w:ascii="Times New Roman" w:hAnsi="Times New Roman" w:cs="Times New Roman"/>
+          <w:sz w:val="24"/>
+          <w:szCs w:val="24"/>
         </w:rPr>
         <w:lastRenderedPageBreak/>
-        <w:t>Task 2</w:t>
+        <w:t>T</w:t>
+      </w:r>
+      <w:r>
+        <w:rPr>
+          <w:rFonts w:ascii="Times New Roman" w:hAnsi="Times New Roman" w:cs="Times New Roman"/>
+          <w:sz w:val="24"/>
+          <w:szCs w:val="24"/>
+        </w:rPr>
+        <w:t>ASK</w:t>
+      </w:r>
+      <w:r>
+        <w:rPr>
+          <w:rFonts w:ascii="Times New Roman" w:hAnsi="Times New Roman" w:cs="Times New Roman"/>
+          <w:sz w:val="24"/>
+          <w:szCs w:val="24"/>
+        </w:rPr>
+        <w:t xml:space="preserve"> 2</w:t>
       </w:r>
     </w:p>
     <w:p/>
@@ -276,15 +662,15 @@
         <w:pStyle w:val="Heading1"/>
         <w:rPr>
           <w:rFonts w:ascii="Times New Roman" w:hAnsi="Times New Roman" w:cs="Times New Roman"/>
-          <w:sz w:val="44"/>
-          <w:szCs w:val="44"/>
-        </w:rPr>
-      </w:pPr>
-      <w:r>
-        <w:rPr>
-          <w:rFonts w:ascii="Times New Roman" w:hAnsi="Times New Roman" w:cs="Times New Roman"/>
-          <w:sz w:val="44"/>
-          <w:szCs w:val="44"/>
+          <w:sz w:val="24"/>
+          <w:szCs w:val="24"/>
+        </w:rPr>
+      </w:pPr>
+      <w:r>
+        <w:rPr>
+          <w:rFonts w:ascii="Times New Roman" w:hAnsi="Times New Roman" w:cs="Times New Roman"/>
+          <w:sz w:val="24"/>
+          <w:szCs w:val="24"/>
         </w:rPr>
         <w:t>Build Your Student Digital Portfolio</w:t>
       </w:r>
@@ -293,550 +679,1239 @@
     <w:p>
       <w:pPr>
         <w:pStyle w:val="NormalWeb"/>
-        <w:rPr>
-          <w:sz w:val="36"/>
-          <w:szCs w:val="36"/>
-        </w:rPr>
-      </w:pPr>
-      <w:r>
-        <w:rPr>
-          <w:sz w:val="36"/>
-          <w:szCs w:val="36"/>
-        </w:rPr>
+      </w:pPr>
+      <w:r>
         <w:t xml:space="preserve">I chose to create profiles on </w:t>
       </w:r>
       <w:r>
         <w:rPr>
           <w:b/>
           <w:bCs/>
-          <w:sz w:val="36"/>
-          <w:szCs w:val="36"/>
         </w:rPr>
         <w:t>GitHub</w:t>
       </w:r>
       <w:r>
-        <w:rPr>
-          <w:sz w:val="36"/>
-          <w:szCs w:val="36"/>
-        </w:rPr>
         <w:t xml:space="preserve">, </w:t>
       </w:r>
       <w:r>
         <w:rPr>
           <w:b/>
           <w:bCs/>
-          <w:sz w:val="36"/>
-          <w:szCs w:val="36"/>
         </w:rPr>
         <w:t>LinkedIn</w:t>
       </w:r>
       <w:r>
-        <w:rPr>
-          <w:sz w:val="36"/>
-          <w:szCs w:val="36"/>
-        </w:rPr>
         <w:t xml:space="preserve">, </w:t>
       </w:r>
       <w:r>
         <w:rPr>
           <w:b/>
           <w:bCs/>
-          <w:sz w:val="36"/>
-          <w:szCs w:val="36"/>
         </w:rPr>
         <w:t>Kaggle</w:t>
       </w:r>
       <w:r>
-        <w:rPr>
-          <w:sz w:val="36"/>
-          <w:szCs w:val="36"/>
-        </w:rPr>
         <w:t xml:space="preserve">, and </w:t>
       </w:r>
       <w:r>
         <w:rPr>
           <w:b/>
           <w:bCs/>
-          <w:sz w:val="36"/>
-          <w:szCs w:val="36"/>
         </w:rPr>
         <w:t>Stack Overflow</w:t>
       </w:r>
       <w:r>
-        <w:rPr>
-          <w:sz w:val="36"/>
-          <w:szCs w:val="36"/>
-        </w:rPr>
         <w:t xml:space="preserve"> because I feel these platforms will genuinely help me grow during my college journey. </w:t>
       </w:r>
     </w:p>
     <w:p>
       <w:pPr>
         <w:pStyle w:val="NormalWeb"/>
-        <w:rPr>
-          <w:sz w:val="36"/>
-          <w:szCs w:val="36"/>
-        </w:rPr>
-      </w:pPr>
-      <w:r>
-        <w:rPr>
-          <w:sz w:val="36"/>
-          <w:szCs w:val="36"/>
-        </w:rPr>
+      </w:pPr>
+      <w:r>
         <w:t xml:space="preserve">GitHub is where I plan to upload and manage my projects, so over time I can actually see how much I’ve improved. </w:t>
       </w:r>
     </w:p>
     <w:p>
       <w:pPr>
         <w:pStyle w:val="NormalWeb"/>
-        <w:rPr>
-          <w:sz w:val="36"/>
-          <w:szCs w:val="36"/>
-        </w:rPr>
-      </w:pPr>
-      <w:r>
-        <w:rPr>
-          <w:sz w:val="36"/>
-          <w:szCs w:val="36"/>
-        </w:rPr>
+      </w:pPr>
+      <w:r>
         <w:t xml:space="preserve">LinkedIn feels important to me for building a professional identity early and staying connected with people in the tech field. </w:t>
       </w:r>
     </w:p>
     <w:p>
       <w:pPr>
         <w:pStyle w:val="NormalWeb"/>
-        <w:rPr>
-          <w:sz w:val="36"/>
-          <w:szCs w:val="36"/>
-        </w:rPr>
-      </w:pPr>
-      <w:r>
-        <w:rPr>
-          <w:sz w:val="36"/>
-          <w:szCs w:val="36"/>
-        </w:rPr>
+      </w:pPr>
+      <w:r>
         <w:t xml:space="preserve">Kaggle is something I’m particularly interested in exploring, as it will help me understand data science and improve my problem-solving skills through real datasets. </w:t>
       </w:r>
     </w:p>
     <w:p>
       <w:pPr>
         <w:pStyle w:val="NormalWeb"/>
-        <w:rPr>
-          <w:sz w:val="36"/>
-          <w:szCs w:val="36"/>
-        </w:rPr>
-      </w:pPr>
-      <w:r>
-        <w:rPr>
-          <w:sz w:val="36"/>
-          <w:szCs w:val="36"/>
-        </w:rPr>
+      </w:pPr>
+      <w:r>
         <w:t>Stack Overflow is something I already find useful, since whenever I get stuck while coding, I can look for solutions or even ask questions.</w:t>
       </w:r>
     </w:p>
     <w:p>
       <w:pPr>
         <w:pStyle w:val="NormalWeb"/>
-        <w:rPr>
-          <w:sz w:val="36"/>
-          <w:szCs w:val="36"/>
-        </w:rPr>
-      </w:pPr>
-      <w:r>
-        <w:rPr>
-          <w:sz w:val="36"/>
-          <w:szCs w:val="36"/>
-        </w:rPr>
+      </w:pPr>
+      <w:r>
         <w:t>Over the next four years, I want to consistently use GitHub to build a strong portfolio, while using LinkedIn to connect with others and learn about opportunities. I plan to use Kaggle to slowly improve my analytical thinking, and Stack Overflow as a support system whenever I face difficulties. Overall, I see these platforms as tools that will help me learn beyond just classroom studies.</w:t>
       </w:r>
     </w:p>
+    <w:p>
+      <w:pPr>
+        <w:pStyle w:val="Title"/>
+        <w:jc w:val="center"/>
+        <w:rPr>
+          <w:rFonts w:ascii="Times New Roman" w:hAnsi="Times New Roman" w:cs="Times New Roman"/>
+          <w:sz w:val="24"/>
+          <w:szCs w:val="24"/>
+        </w:rPr>
+      </w:pPr>
+    </w:p>
+    <w:p>
+      <w:pPr>
+        <w:pStyle w:val="Title"/>
+        <w:jc w:val="center"/>
+        <w:rPr>
+          <w:rFonts w:ascii="Times New Roman" w:hAnsi="Times New Roman" w:cs="Times New Roman"/>
+          <w:sz w:val="24"/>
+          <w:szCs w:val="24"/>
+        </w:rPr>
+      </w:pPr>
+      <w:r>
+        <w:rPr>
+          <w:rFonts w:ascii="Times New Roman" w:hAnsi="Times New Roman" w:cs="Times New Roman"/>
+          <w:sz w:val="24"/>
+          <w:szCs w:val="24"/>
+        </w:rPr>
+        <w:t>T</w:t>
+      </w:r>
+      <w:r>
+        <w:rPr>
+          <w:rFonts w:ascii="Times New Roman" w:hAnsi="Times New Roman" w:cs="Times New Roman"/>
+          <w:sz w:val="24"/>
+          <w:szCs w:val="24"/>
+        </w:rPr>
+        <w:t>ASK</w:t>
+      </w:r>
+      <w:r>
+        <w:rPr>
+          <w:rFonts w:ascii="Times New Roman" w:hAnsi="Times New Roman" w:cs="Times New Roman"/>
+          <w:sz w:val="24"/>
+          <w:szCs w:val="24"/>
+        </w:rPr>
+        <w:t xml:space="preserve"> 3</w:t>
+      </w:r>
+    </w:p>
     <w:p/>
     <w:p>
       <w:pPr>
-        <w:pStyle w:val="Title"/>
-        <w:jc w:val="center"/>
-        <w:rPr>
-          <w:rFonts w:ascii="Times New Roman" w:hAnsi="Times New Roman" w:cs="Times New Roman"/>
-          <w:sz w:val="72"/>
-          <w:szCs w:val="72"/>
-        </w:rPr>
-      </w:pPr>
-      <w:r>
-        <w:rPr>
-          <w:rFonts w:ascii="Times New Roman" w:hAnsi="Times New Roman" w:cs="Times New Roman"/>
-          <w:sz w:val="72"/>
-          <w:szCs w:val="72"/>
+        <w:pStyle w:val="Heading1"/>
+        <w:rPr>
+          <w:rFonts w:ascii="Times New Roman" w:hAnsi="Times New Roman" w:cs="Times New Roman"/>
+          <w:sz w:val="24"/>
+          <w:szCs w:val="24"/>
+        </w:rPr>
+      </w:pPr>
+      <w:r>
+        <w:rPr>
+          <w:rFonts w:ascii="Times New Roman" w:hAnsi="Times New Roman" w:cs="Times New Roman"/>
+          <w:sz w:val="24"/>
+          <w:szCs w:val="24"/>
+        </w:rPr>
+        <w:t>Explore Coding &amp; Collaboration Platforms</w:t>
+      </w:r>
+    </w:p>
+    <w:p>
+      <w:pPr>
+        <w:pStyle w:val="NormalWeb"/>
+      </w:pPr>
+    </w:p>
+    <w:p>
+      <w:pPr>
+        <w:pStyle w:val="NormalWeb"/>
+      </w:pPr>
+      <w:r>
+        <w:t xml:space="preserve">For Part A, I used </w:t>
+      </w:r>
+      <w:proofErr w:type="spellStart"/>
+      <w:r>
+        <w:t>HackerRank</w:t>
+      </w:r>
+      <w:proofErr w:type="spellEnd"/>
+      <w:r>
+        <w:t xml:space="preserve"> to solve a beginner-level problem called “Solve Me First.” This helped me understand how to take input, process it, and display output correctly in a coding environment. It was a simple problem but it gave me confidence in using the platform and understanding how programming challenges are structured. It also made me realize the importance of logic and accuracy in even basic problems.</w:t>
+      </w:r>
+    </w:p>
+    <w:p>
+      <w:pPr>
+        <w:pStyle w:val="NormalWeb"/>
+      </w:pPr>
+    </w:p>
+    <w:p>
+      <w:pPr>
+        <w:pStyle w:val="NormalWeb"/>
+      </w:pPr>
+      <w:r>
+        <w:t>For Part B, I created a Google Form as a Digital Literacy Awareness Quiz consisting of five questions. I included multiple-choice and short answer questions to make it interactive and useful for my classmates. I also viewed the responses in Google Sheets, which helped me understand how data is collected and organized automatically in google Sheets.</w:t>
+      </w:r>
+    </w:p>
+    <w:p>
+      <w:pPr>
+        <w:pStyle w:val="NormalWeb"/>
+      </w:pPr>
+    </w:p>
+    <w:p>
+      <w:pPr>
+        <w:pStyle w:val="NormalWeb"/>
+      </w:pPr>
+      <w:r>
+        <w:t xml:space="preserve">These tools will help me academically by improving my coding skills and making collaboration easier. Platforms like </w:t>
+      </w:r>
+      <w:proofErr w:type="spellStart"/>
+      <w:r>
+        <w:t>HackerRank</w:t>
+      </w:r>
+      <w:proofErr w:type="spellEnd"/>
+      <w:r>
+        <w:t xml:space="preserve"> will strengthen my problem-solving ability, while Google Forms will help me conduct surveys and organize information efficiently during projects and assignments.</w:t>
+      </w:r>
+    </w:p>
+    <w:p>
+      <w:pPr>
+        <w:pStyle w:val="Title"/>
+        <w:jc w:val="center"/>
+        <w:rPr>
+          <w:rFonts w:ascii="Times New Roman" w:hAnsi="Times New Roman" w:cs="Times New Roman"/>
+          <w:sz w:val="24"/>
+          <w:szCs w:val="24"/>
+        </w:rPr>
+      </w:pPr>
+    </w:p>
+    <w:p>
+      <w:pPr>
+        <w:pStyle w:val="Title"/>
+        <w:jc w:val="center"/>
+        <w:rPr>
+          <w:rFonts w:ascii="Times New Roman" w:hAnsi="Times New Roman" w:cs="Times New Roman"/>
+          <w:sz w:val="24"/>
+          <w:szCs w:val="24"/>
+        </w:rPr>
+      </w:pPr>
+    </w:p>
+    <w:p>
+      <w:pPr>
+        <w:pStyle w:val="Title"/>
+        <w:jc w:val="center"/>
+        <w:rPr>
+          <w:rFonts w:ascii="Times New Roman" w:hAnsi="Times New Roman" w:cs="Times New Roman"/>
+          <w:sz w:val="24"/>
+          <w:szCs w:val="24"/>
+        </w:rPr>
+      </w:pPr>
+    </w:p>
+    <w:p>
+      <w:pPr>
+        <w:pStyle w:val="Title"/>
+        <w:jc w:val="center"/>
+        <w:rPr>
+          <w:rFonts w:ascii="Times New Roman" w:hAnsi="Times New Roman" w:cs="Times New Roman"/>
+          <w:sz w:val="24"/>
+          <w:szCs w:val="24"/>
+        </w:rPr>
+      </w:pPr>
+    </w:p>
+    <w:p>
+      <w:pPr>
+        <w:pStyle w:val="Title"/>
+        <w:jc w:val="center"/>
+        <w:rPr>
+          <w:rFonts w:ascii="Times New Roman" w:hAnsi="Times New Roman" w:cs="Times New Roman"/>
+          <w:sz w:val="24"/>
+          <w:szCs w:val="24"/>
+        </w:rPr>
+      </w:pPr>
+    </w:p>
+    <w:p>
+      <w:pPr>
+        <w:pStyle w:val="Title"/>
+        <w:jc w:val="center"/>
+        <w:rPr>
+          <w:rFonts w:ascii="Times New Roman" w:hAnsi="Times New Roman" w:cs="Times New Roman"/>
+          <w:sz w:val="24"/>
+          <w:szCs w:val="24"/>
+        </w:rPr>
+      </w:pPr>
+      <w:r>
+        <w:rPr>
+          <w:rFonts w:ascii="Times New Roman" w:hAnsi="Times New Roman" w:cs="Times New Roman"/>
+          <w:sz w:val="24"/>
+          <w:szCs w:val="24"/>
+        </w:rPr>
+        <w:t>TASK 4</w:t>
+      </w:r>
+    </w:p>
+    <w:p/>
+    <w:p>
+      <w:pPr>
+        <w:pStyle w:val="Heading1"/>
+        <w:rPr>
+          <w:rFonts w:ascii="Times New Roman" w:hAnsi="Times New Roman" w:cs="Times New Roman"/>
+          <w:sz w:val="24"/>
+          <w:szCs w:val="24"/>
+        </w:rPr>
+      </w:pPr>
+      <w:r>
+        <w:rPr>
+          <w:rFonts w:ascii="Times New Roman" w:hAnsi="Times New Roman" w:cs="Times New Roman"/>
+          <w:sz w:val="24"/>
+          <w:szCs w:val="24"/>
+        </w:rPr>
+        <w:t>Draft a Professional Email &amp; Etiquette Guide</w:t>
+      </w:r>
+    </w:p>
+    <w:p/>
+    <w:p>
+      <w:pPr>
+        <w:pStyle w:val="NormalWeb"/>
+      </w:pPr>
+      <w:r>
+        <w:t>One situation where poor digital communication can cause a serious problem is when a student sends an unprofessional or unclear email to a professor. For instance, if a student writes an email without a proper subject line, uses overly casual language like “Hey,” or does not clearly explain the purpose of the message, the professor may misunderstand the request or fail to recognize its importance. In some cases, such emails might be ignored or delayed, which can lead to negative consequences such as missing assignment deadlines, not receiving important clarifications, or even losing the chance to request an extension.</w:t>
+      </w:r>
+    </w:p>
+    <w:p>
+      <w:pPr>
+        <w:pStyle w:val="NormalWeb"/>
+      </w:pPr>
+    </w:p>
+    <w:p>
+      <w:pPr>
+        <w:pStyle w:val="NormalWeb"/>
+      </w:pPr>
+      <w:r>
+        <w:t>This issue could have been avoided by following proper email etiquette. The student should include a clear and relevant subject line that reflects the purpose of the email, use a respectful greeting, and present their message in a structured and polite manner. It is also important to keep the content concise while including all necessary details. Additionally, proofreading the email before sending it can help avoid grammatical errors and improve clarity. Overall, clear and professional digital communication ensures that the message is understood correctly and helps build a positive and respectful impression.</w:t>
+      </w:r>
+    </w:p>
+    <w:p/>
+    <w:p>
+      <w:pPr>
+        <w:pStyle w:val="Title"/>
+        <w:jc w:val="center"/>
+        <w:rPr>
+          <w:rFonts w:ascii="Times New Roman" w:hAnsi="Times New Roman" w:cs="Times New Roman"/>
+          <w:sz w:val="24"/>
+          <w:szCs w:val="24"/>
+        </w:rPr>
+      </w:pPr>
+    </w:p>
+    <w:p>
+      <w:pPr>
+        <w:pStyle w:val="Title"/>
+        <w:jc w:val="center"/>
+        <w:rPr>
+          <w:rFonts w:ascii="Times New Roman" w:hAnsi="Times New Roman" w:cs="Times New Roman"/>
+          <w:sz w:val="24"/>
+          <w:szCs w:val="24"/>
+        </w:rPr>
+      </w:pPr>
+    </w:p>
+    <w:p>
+      <w:pPr>
+        <w:pStyle w:val="Title"/>
+        <w:jc w:val="center"/>
+        <w:rPr>
+          <w:rFonts w:ascii="Times New Roman" w:hAnsi="Times New Roman" w:cs="Times New Roman"/>
+          <w:sz w:val="24"/>
+          <w:szCs w:val="24"/>
+        </w:rPr>
+      </w:pPr>
+    </w:p>
+    <w:p>
+      <w:pPr>
+        <w:pStyle w:val="Title"/>
+        <w:jc w:val="center"/>
+        <w:rPr>
+          <w:rFonts w:ascii="Times New Roman" w:hAnsi="Times New Roman" w:cs="Times New Roman"/>
+          <w:sz w:val="24"/>
+          <w:szCs w:val="24"/>
+        </w:rPr>
+      </w:pPr>
+    </w:p>
+    <w:p>
+      <w:pPr>
+        <w:pStyle w:val="Title"/>
+        <w:jc w:val="center"/>
+        <w:rPr>
+          <w:rFonts w:ascii="Times New Roman" w:hAnsi="Times New Roman" w:cs="Times New Roman"/>
+          <w:sz w:val="24"/>
+          <w:szCs w:val="24"/>
+        </w:rPr>
+      </w:pPr>
+    </w:p>
+    <w:p>
+      <w:pPr>
+        <w:pStyle w:val="Title"/>
+        <w:jc w:val="center"/>
+        <w:rPr>
+          <w:rFonts w:ascii="Times New Roman" w:hAnsi="Times New Roman" w:cs="Times New Roman"/>
+          <w:sz w:val="24"/>
+          <w:szCs w:val="24"/>
+        </w:rPr>
+      </w:pPr>
+    </w:p>
+    <w:p>
+      <w:pPr>
+        <w:pStyle w:val="Title"/>
+        <w:jc w:val="center"/>
+        <w:rPr>
+          <w:rFonts w:ascii="Times New Roman" w:hAnsi="Times New Roman" w:cs="Times New Roman"/>
+          <w:sz w:val="24"/>
+          <w:szCs w:val="24"/>
+        </w:rPr>
+      </w:pPr>
+    </w:p>
+    <w:p>
+      <w:pPr>
+        <w:pStyle w:val="Title"/>
+        <w:jc w:val="center"/>
+        <w:rPr>
+          <w:rFonts w:ascii="Times New Roman" w:hAnsi="Times New Roman" w:cs="Times New Roman"/>
+          <w:sz w:val="24"/>
+          <w:szCs w:val="24"/>
+        </w:rPr>
+      </w:pPr>
+    </w:p>
+    <w:p>
+      <w:pPr>
+        <w:pStyle w:val="Title"/>
+        <w:jc w:val="center"/>
+        <w:rPr>
+          <w:rFonts w:ascii="Times New Roman" w:hAnsi="Times New Roman" w:cs="Times New Roman"/>
+          <w:sz w:val="24"/>
+          <w:szCs w:val="24"/>
+        </w:rPr>
+      </w:pPr>
+    </w:p>
+    <w:p>
+      <w:pPr>
+        <w:pStyle w:val="Title"/>
+        <w:jc w:val="center"/>
+        <w:rPr>
+          <w:rFonts w:ascii="Times New Roman" w:hAnsi="Times New Roman" w:cs="Times New Roman"/>
+          <w:sz w:val="24"/>
+          <w:szCs w:val="24"/>
+        </w:rPr>
+      </w:pPr>
+    </w:p>
+    <w:p>
+      <w:pPr>
+        <w:pStyle w:val="Title"/>
+        <w:jc w:val="center"/>
+        <w:rPr>
+          <w:rFonts w:ascii="Times New Roman" w:hAnsi="Times New Roman" w:cs="Times New Roman"/>
+          <w:sz w:val="24"/>
+          <w:szCs w:val="24"/>
+        </w:rPr>
+      </w:pPr>
+    </w:p>
+    <w:p>
+      <w:pPr>
+        <w:pStyle w:val="Title"/>
+        <w:jc w:val="center"/>
+        <w:rPr>
+          <w:rFonts w:ascii="Times New Roman" w:hAnsi="Times New Roman" w:cs="Times New Roman"/>
+          <w:sz w:val="24"/>
+          <w:szCs w:val="24"/>
+        </w:rPr>
+      </w:pPr>
+    </w:p>
+    <w:p>
+      <w:pPr>
+        <w:pStyle w:val="Title"/>
+        <w:jc w:val="center"/>
+        <w:rPr>
+          <w:rFonts w:ascii="Times New Roman" w:hAnsi="Times New Roman" w:cs="Times New Roman"/>
+          <w:sz w:val="24"/>
+          <w:szCs w:val="24"/>
+        </w:rPr>
+      </w:pPr>
+    </w:p>
+    <w:p>
+      <w:pPr>
+        <w:pStyle w:val="Title"/>
+        <w:jc w:val="center"/>
+        <w:rPr>
+          <w:rFonts w:ascii="Times New Roman" w:hAnsi="Times New Roman" w:cs="Times New Roman"/>
+          <w:sz w:val="24"/>
+          <w:szCs w:val="24"/>
+        </w:rPr>
+      </w:pPr>
+    </w:p>
+    <w:p>
+      <w:pPr>
+        <w:pStyle w:val="Title"/>
+        <w:jc w:val="center"/>
+        <w:rPr>
+          <w:rFonts w:ascii="Times New Roman" w:hAnsi="Times New Roman" w:cs="Times New Roman"/>
+          <w:sz w:val="24"/>
+          <w:szCs w:val="24"/>
+        </w:rPr>
+      </w:pPr>
+    </w:p>
+    <w:p>
+      <w:pPr>
+        <w:pStyle w:val="Title"/>
+        <w:jc w:val="center"/>
+        <w:rPr>
+          <w:rFonts w:ascii="Times New Roman" w:hAnsi="Times New Roman" w:cs="Times New Roman"/>
+          <w:sz w:val="24"/>
+          <w:szCs w:val="24"/>
+        </w:rPr>
+      </w:pPr>
+    </w:p>
+    <w:p>
+      <w:pPr>
+        <w:pStyle w:val="Title"/>
+        <w:jc w:val="center"/>
+        <w:rPr>
+          <w:rFonts w:ascii="Times New Roman" w:hAnsi="Times New Roman" w:cs="Times New Roman"/>
+          <w:sz w:val="24"/>
+          <w:szCs w:val="24"/>
+        </w:rPr>
+      </w:pPr>
+      <w:r>
+        <w:rPr>
+          <w:rFonts w:ascii="Times New Roman" w:hAnsi="Times New Roman" w:cs="Times New Roman"/>
+          <w:sz w:val="24"/>
+          <w:szCs w:val="24"/>
+        </w:rPr>
+        <w:t>T</w:t>
+      </w:r>
+      <w:r>
+        <w:rPr>
+          <w:rFonts w:ascii="Times New Roman" w:hAnsi="Times New Roman" w:cs="Times New Roman"/>
+          <w:sz w:val="24"/>
+          <w:szCs w:val="24"/>
+        </w:rPr>
+        <w:t>ASK</w:t>
+      </w:r>
+      <w:r>
+        <w:rPr>
+          <w:rFonts w:ascii="Times New Roman" w:hAnsi="Times New Roman" w:cs="Times New Roman"/>
+          <w:sz w:val="24"/>
+          <w:szCs w:val="24"/>
+        </w:rPr>
+        <w:t xml:space="preserve"> 5</w:t>
+      </w:r>
+    </w:p>
+    <w:p/>
+    <w:p>
+      <w:pPr>
+        <w:pStyle w:val="Heading1"/>
+        <w:rPr>
+          <w:rFonts w:ascii="Times New Roman" w:hAnsi="Times New Roman" w:cs="Times New Roman"/>
+          <w:sz w:val="24"/>
+          <w:szCs w:val="24"/>
+        </w:rPr>
+      </w:pPr>
+      <w:r>
+        <w:rPr>
+          <w:rFonts w:ascii="Times New Roman" w:hAnsi="Times New Roman" w:cs="Times New Roman"/>
+          <w:sz w:val="24"/>
+          <w:szCs w:val="24"/>
+        </w:rPr>
+        <w:t>Cybercrime Awareness Case Study &amp; Prevention Guide</w:t>
+      </w:r>
+    </w:p>
+    <w:p/>
+    <w:p>
+      <w:pPr>
+        <w:pStyle w:val="NormalWeb"/>
+      </w:pPr>
+      <w:r>
+        <w:t xml:space="preserve">While researching and creating the Stay Safe Online prevention checklist what surprised me the most was how many common online habits can actually lead to serious security risks. I realized that many students including myself often overlook basic precautions like checking website authenticity or ignoring suspicious links. I was also surprised to learn how frequently financial fraud happens through UPI especially when people unknowingly approve payment requests or share sensitive information like OTPs, </w:t>
+      </w:r>
+      <w:proofErr w:type="gramStart"/>
+      <w:r>
+        <w:t>These</w:t>
+      </w:r>
+      <w:proofErr w:type="gramEnd"/>
+      <w:r>
+        <w:t xml:space="preserve"> small mistakes can lead to significant financial and personal loss.</w:t>
+      </w:r>
+    </w:p>
+    <w:p>
+      <w:pPr>
+        <w:pStyle w:val="NormalWeb"/>
+      </w:pPr>
+      <w:r>
+        <w:t>As a result of this research, one habit I will personally change is being more cautious while handling online transactions and messages. I will make it a point to always verify payment requests and avoid clicking on unknown links. Additionally, I will enable stronger security measures like two-factor authentication on my accounts. This activity has helped me understand the importance of being alert and responsible online, and I will apply these practices in my daily digital interactions.</w:t>
+      </w:r>
+    </w:p>
+    <w:p/>
+    <w:p/>
+    <w:p>
+      <w:pPr>
+        <w:pStyle w:val="Title"/>
+        <w:jc w:val="center"/>
+        <w:rPr>
+          <w:rFonts w:ascii="Times New Roman" w:hAnsi="Times New Roman" w:cs="Times New Roman"/>
+          <w:sz w:val="24"/>
+          <w:szCs w:val="24"/>
+        </w:rPr>
+      </w:pPr>
+    </w:p>
+    <w:p>
+      <w:pPr>
+        <w:pStyle w:val="Title"/>
+        <w:jc w:val="center"/>
+        <w:rPr>
+          <w:rFonts w:ascii="Times New Roman" w:hAnsi="Times New Roman" w:cs="Times New Roman"/>
+          <w:sz w:val="24"/>
+          <w:szCs w:val="24"/>
+        </w:rPr>
+      </w:pPr>
+    </w:p>
+    <w:p>
+      <w:pPr>
+        <w:pStyle w:val="Title"/>
+        <w:jc w:val="center"/>
+        <w:rPr>
+          <w:rFonts w:ascii="Times New Roman" w:hAnsi="Times New Roman" w:cs="Times New Roman"/>
+          <w:sz w:val="24"/>
+          <w:szCs w:val="24"/>
+        </w:rPr>
+      </w:pPr>
+      <w:r>
+        <w:rPr>
+          <w:rFonts w:ascii="Times New Roman" w:hAnsi="Times New Roman" w:cs="Times New Roman"/>
+          <w:sz w:val="24"/>
+          <w:szCs w:val="24"/>
+        </w:rPr>
+        <w:t>Conclusion</w:t>
+      </w:r>
+    </w:p>
+    <w:p>
+      <w:pPr>
+        <w:pStyle w:val="Title"/>
+        <w:rPr>
+          <w:rFonts w:ascii="Times New Roman" w:eastAsia="Times New Roman" w:hAnsi="Times New Roman" w:cs="Times New Roman"/>
+          <w:spacing w:val="0"/>
+          <w:kern w:val="0"/>
+          <w:sz w:val="24"/>
+          <w:szCs w:val="24"/>
+          <w:lang w:eastAsia="en-IN"/>
+          <w14:ligatures w14:val="none"/>
+        </w:rPr>
+      </w:pPr>
+    </w:p>
+    <w:p>
+      <w:pPr>
+        <w:pStyle w:val="Title"/>
+        <w:rPr>
+          <w:rFonts w:ascii="Times New Roman" w:eastAsia="Times New Roman" w:hAnsi="Times New Roman" w:cs="Times New Roman"/>
+          <w:spacing w:val="0"/>
+          <w:kern w:val="0"/>
+          <w:sz w:val="24"/>
+          <w:szCs w:val="24"/>
+          <w:lang w:eastAsia="en-IN"/>
+          <w14:ligatures w14:val="none"/>
+        </w:rPr>
+      </w:pPr>
+    </w:p>
+    <w:p>
+      <w:pPr>
+        <w:pStyle w:val="Title"/>
+        <w:rPr>
+          <w:rFonts w:ascii="Times New Roman" w:eastAsia="Times New Roman" w:hAnsi="Times New Roman" w:cs="Times New Roman"/>
+          <w:spacing w:val="0"/>
+          <w:kern w:val="0"/>
+          <w:sz w:val="24"/>
+          <w:szCs w:val="24"/>
+          <w:lang w:eastAsia="en-IN"/>
+          <w14:ligatures w14:val="none"/>
+        </w:rPr>
+      </w:pPr>
+      <w:r>
+        <w:rPr>
+          <w:rFonts w:ascii="Times New Roman" w:eastAsia="Times New Roman" w:hAnsi="Times New Roman" w:cs="Times New Roman"/>
+          <w:spacing w:val="0"/>
+          <w:kern w:val="0"/>
+          <w:sz w:val="24"/>
+          <w:szCs w:val="24"/>
+          <w:lang w:eastAsia="en-IN"/>
+          <w14:ligatures w14:val="none"/>
+        </w:rPr>
+        <w:t xml:space="preserve">In conclusion, this project helped me understand the importance of digital literacy in a much better way. Through the different tasks, I was able to learn about online tools, communication, and safety practices which are very useful for students. Building my portfolio and exploring platforms like GitHub was something new and interesting for me. I also realized how important it is to behave responsibly online and avoid risks like cybercrime. Some parts of the project </w:t>
+      </w:r>
+      <w:proofErr w:type="gramStart"/>
+      <w:r>
+        <w:rPr>
+          <w:rFonts w:ascii="Times New Roman" w:eastAsia="Times New Roman" w:hAnsi="Times New Roman" w:cs="Times New Roman"/>
+          <w:spacing w:val="0"/>
+          <w:kern w:val="0"/>
+          <w:sz w:val="24"/>
+          <w:szCs w:val="24"/>
+          <w:lang w:eastAsia="en-IN"/>
+          <w14:ligatures w14:val="none"/>
+        </w:rPr>
+        <w:t>was</w:t>
+      </w:r>
+      <w:proofErr w:type="gramEnd"/>
+      <w:r>
+        <w:rPr>
+          <w:rFonts w:ascii="Times New Roman" w:eastAsia="Times New Roman" w:hAnsi="Times New Roman" w:cs="Times New Roman"/>
+          <w:spacing w:val="0"/>
+          <w:kern w:val="0"/>
+          <w:sz w:val="24"/>
+          <w:szCs w:val="24"/>
+          <w:lang w:eastAsia="en-IN"/>
+          <w14:ligatures w14:val="none"/>
+        </w:rPr>
+        <w:t xml:space="preserve"> a bit confusing at first, but </w:t>
+      </w:r>
+      <w:proofErr w:type="gramStart"/>
+      <w:r>
+        <w:rPr>
+          <w:rFonts w:ascii="Times New Roman" w:eastAsia="Times New Roman" w:hAnsi="Times New Roman" w:cs="Times New Roman"/>
+          <w:spacing w:val="0"/>
+          <w:kern w:val="0"/>
+          <w:sz w:val="24"/>
+          <w:szCs w:val="24"/>
+          <w:lang w:eastAsia="en-IN"/>
+          <w14:ligatures w14:val="none"/>
+        </w:rPr>
+        <w:t>overall</w:t>
+      </w:r>
+      <w:proofErr w:type="gramEnd"/>
+      <w:r>
+        <w:rPr>
+          <w:rFonts w:ascii="Times New Roman" w:eastAsia="Times New Roman" w:hAnsi="Times New Roman" w:cs="Times New Roman"/>
+          <w:spacing w:val="0"/>
+          <w:kern w:val="0"/>
+          <w:sz w:val="24"/>
+          <w:szCs w:val="24"/>
+          <w:lang w:eastAsia="en-IN"/>
+          <w14:ligatures w14:val="none"/>
+        </w:rPr>
+        <w:t xml:space="preserve"> it was a good learning experience. I feel more confident now in using digital platforms and managing my online presence properly.</w:t>
+      </w:r>
+    </w:p>
+    <w:p>
+      <w:pPr>
+        <w:rPr>
+          <w:rFonts w:ascii="Times New Roman" w:eastAsia="Times New Roman" w:hAnsi="Times New Roman" w:cs="Times New Roman"/>
+          <w:kern w:val="0"/>
+          <w:lang w:eastAsia="en-IN"/>
+          <w14:ligatures w14:val="none"/>
+        </w:rPr>
+      </w:pPr>
+    </w:p>
+    <w:p/>
+    <w:p/>
+    <w:p>
+      <w:pPr>
+        <w:jc w:val="center"/>
+        <w:rPr>
+          <w:rFonts w:ascii="Times New Roman" w:eastAsia="Times New Roman" w:hAnsi="Times New Roman" w:cs="Times New Roman"/>
+          <w:kern w:val="0"/>
+          <w:lang w:eastAsia="en-IN"/>
+          <w14:ligatures w14:val="none"/>
+        </w:rPr>
+      </w:pPr>
+      <w:r>
+        <w:rPr>
+          <w:rFonts w:ascii="Times New Roman" w:eastAsia="Times New Roman" w:hAnsi="Times New Roman" w:cs="Times New Roman"/>
+          <w:kern w:val="0"/>
+          <w:lang w:eastAsia="en-IN"/>
+          <w14:ligatures w14:val="none"/>
         </w:rPr>
         <w:lastRenderedPageBreak/>
-        <w:t>Task 3</w:t>
-      </w:r>
-    </w:p>
-    <w:p/>
-    <w:p>
-      <w:pPr>
-        <w:pStyle w:val="Heading1"/>
-        <w:rPr>
-          <w:rFonts w:ascii="Times New Roman" w:hAnsi="Times New Roman" w:cs="Times New Roman"/>
-          <w:sz w:val="44"/>
-          <w:szCs w:val="44"/>
-        </w:rPr>
-      </w:pPr>
-      <w:r>
-        <w:rPr>
-          <w:rFonts w:ascii="Times New Roman" w:hAnsi="Times New Roman" w:cs="Times New Roman"/>
-          <w:sz w:val="44"/>
-          <w:szCs w:val="44"/>
-        </w:rPr>
-        <w:t>Explore Coding &amp; Collaboration Platforms</w:t>
-      </w:r>
-    </w:p>
-    <w:p>
-      <w:pPr>
-        <w:pStyle w:val="NormalWeb"/>
-        <w:rPr>
-          <w:sz w:val="36"/>
-          <w:szCs w:val="36"/>
-        </w:rPr>
-      </w:pPr>
-    </w:p>
-    <w:p>
-      <w:pPr>
-        <w:pStyle w:val="NormalWeb"/>
-        <w:rPr>
-          <w:sz w:val="36"/>
-          <w:szCs w:val="36"/>
-        </w:rPr>
-      </w:pPr>
-      <w:r>
-        <w:rPr>
-          <w:sz w:val="36"/>
-          <w:szCs w:val="36"/>
-        </w:rPr>
-        <w:t xml:space="preserve">For Part A, I used </w:t>
-      </w:r>
+        <w:t>References</w:t>
+      </w:r>
+    </w:p>
+    <w:p>
+      <w:pPr>
+        <w:jc w:val="center"/>
+        <w:rPr>
+          <w:rFonts w:ascii="Times New Roman" w:eastAsia="Times New Roman" w:hAnsi="Times New Roman" w:cs="Times New Roman"/>
+          <w:kern w:val="0"/>
+          <w:lang w:eastAsia="en-IN"/>
+          <w14:ligatures w14:val="none"/>
+        </w:rPr>
+      </w:pPr>
+    </w:p>
+    <w:p>
+      <w:pPr>
+        <w:pStyle w:val="Title"/>
+        <w:numPr>
+          <w:ilvl w:val="0"/>
+          <w:numId w:val="3"/>
+        </w:numPr>
+        <w:rPr>
+          <w:rFonts w:ascii="Times New Roman" w:eastAsia="Times New Roman" w:hAnsi="Times New Roman" w:cs="Times New Roman"/>
+          <w:spacing w:val="0"/>
+          <w:kern w:val="0"/>
+          <w:sz w:val="24"/>
+          <w:szCs w:val="24"/>
+          <w:lang w:eastAsia="en-IN"/>
+          <w14:ligatures w14:val="none"/>
+        </w:rPr>
+      </w:pPr>
+      <w:r>
+        <w:rPr>
+          <w:rFonts w:ascii="Times New Roman" w:eastAsia="Times New Roman" w:hAnsi="Times New Roman" w:cs="Times New Roman"/>
+          <w:spacing w:val="0"/>
+          <w:kern w:val="0"/>
+          <w:sz w:val="24"/>
+          <w:szCs w:val="24"/>
+          <w:lang w:eastAsia="en-IN"/>
+          <w14:ligatures w14:val="none"/>
+        </w:rPr>
+        <w:t xml:space="preserve">Canva – </w:t>
+      </w:r>
+      <w:hyperlink r:id="rId6" w:tgtFrame="_new" w:history="1">
+        <w:r>
+          <w:rPr>
+            <w:rFonts w:ascii="Times New Roman" w:eastAsia="Times New Roman" w:hAnsi="Times New Roman" w:cs="Times New Roman"/>
+            <w:spacing w:val="0"/>
+            <w:kern w:val="0"/>
+            <w:sz w:val="24"/>
+            <w:szCs w:val="24"/>
+            <w:lang w:eastAsia="en-IN"/>
+            <w14:ligatures w14:val="none"/>
+          </w:rPr>
+          <w:t>https://www.canva.com</w:t>
+        </w:r>
+      </w:hyperlink>
+      <w:r>
+        <w:rPr>
+          <w:rFonts w:ascii="Times New Roman" w:eastAsia="Times New Roman" w:hAnsi="Times New Roman" w:cs="Times New Roman"/>
+          <w:spacing w:val="0"/>
+          <w:kern w:val="0"/>
+          <w:sz w:val="24"/>
+          <w:szCs w:val="24"/>
+          <w:lang w:eastAsia="en-IN"/>
+          <w14:ligatures w14:val="none"/>
+        </w:rPr>
+        <w:t xml:space="preserve"> </w:t>
+      </w:r>
+    </w:p>
+    <w:p>
+      <w:pPr>
+        <w:pStyle w:val="Title"/>
+        <w:numPr>
+          <w:ilvl w:val="0"/>
+          <w:numId w:val="3"/>
+        </w:numPr>
+        <w:rPr>
+          <w:rFonts w:ascii="Times New Roman" w:eastAsia="Times New Roman" w:hAnsi="Times New Roman" w:cs="Times New Roman"/>
+          <w:spacing w:val="0"/>
+          <w:kern w:val="0"/>
+          <w:sz w:val="24"/>
+          <w:szCs w:val="24"/>
+          <w:lang w:eastAsia="en-IN"/>
+          <w14:ligatures w14:val="none"/>
+        </w:rPr>
+      </w:pPr>
+      <w:r>
+        <w:rPr>
+          <w:rFonts w:ascii="Times New Roman" w:eastAsia="Times New Roman" w:hAnsi="Times New Roman" w:cs="Times New Roman"/>
+          <w:spacing w:val="0"/>
+          <w:kern w:val="0"/>
+          <w:sz w:val="24"/>
+          <w:szCs w:val="24"/>
+          <w:lang w:eastAsia="en-IN"/>
+          <w14:ligatures w14:val="none"/>
+        </w:rPr>
+        <w:t xml:space="preserve">GitHub – </w:t>
+      </w:r>
+      <w:hyperlink r:id="rId7" w:tgtFrame="_new" w:history="1">
+        <w:r>
+          <w:rPr>
+            <w:rFonts w:ascii="Times New Roman" w:eastAsia="Times New Roman" w:hAnsi="Times New Roman" w:cs="Times New Roman"/>
+            <w:spacing w:val="0"/>
+            <w:kern w:val="0"/>
+            <w:sz w:val="24"/>
+            <w:szCs w:val="24"/>
+            <w:lang w:eastAsia="en-IN"/>
+            <w14:ligatures w14:val="none"/>
+          </w:rPr>
+          <w:t>https://github.com</w:t>
+        </w:r>
+      </w:hyperlink>
+      <w:r>
+        <w:rPr>
+          <w:rFonts w:ascii="Times New Roman" w:eastAsia="Times New Roman" w:hAnsi="Times New Roman" w:cs="Times New Roman"/>
+          <w:spacing w:val="0"/>
+          <w:kern w:val="0"/>
+          <w:sz w:val="24"/>
+          <w:szCs w:val="24"/>
+          <w:lang w:eastAsia="en-IN"/>
+          <w14:ligatures w14:val="none"/>
+        </w:rPr>
+        <w:t xml:space="preserve"> </w:t>
+      </w:r>
+    </w:p>
+    <w:p>
+      <w:pPr>
+        <w:pStyle w:val="Title"/>
+        <w:numPr>
+          <w:ilvl w:val="0"/>
+          <w:numId w:val="3"/>
+        </w:numPr>
+        <w:rPr>
+          <w:rFonts w:ascii="Times New Roman" w:eastAsia="Times New Roman" w:hAnsi="Times New Roman" w:cs="Times New Roman"/>
+          <w:spacing w:val="0"/>
+          <w:kern w:val="0"/>
+          <w:sz w:val="24"/>
+          <w:szCs w:val="24"/>
+          <w:lang w:eastAsia="en-IN"/>
+          <w14:ligatures w14:val="none"/>
+        </w:rPr>
+      </w:pPr>
+      <w:r>
+        <w:rPr>
+          <w:rFonts w:ascii="Times New Roman" w:eastAsia="Times New Roman" w:hAnsi="Times New Roman" w:cs="Times New Roman"/>
+          <w:spacing w:val="0"/>
+          <w:kern w:val="0"/>
+          <w:sz w:val="24"/>
+          <w:szCs w:val="24"/>
+          <w:lang w:eastAsia="en-IN"/>
+          <w14:ligatures w14:val="none"/>
+        </w:rPr>
+        <w:t xml:space="preserve">LinkedIn – </w:t>
+      </w:r>
+      <w:hyperlink r:id="rId8" w:tgtFrame="_new" w:history="1">
+        <w:r>
+          <w:rPr>
+            <w:rFonts w:ascii="Times New Roman" w:eastAsia="Times New Roman" w:hAnsi="Times New Roman" w:cs="Times New Roman"/>
+            <w:spacing w:val="0"/>
+            <w:kern w:val="0"/>
+            <w:sz w:val="24"/>
+            <w:szCs w:val="24"/>
+            <w:lang w:eastAsia="en-IN"/>
+            <w14:ligatures w14:val="none"/>
+          </w:rPr>
+          <w:t>https://www.linkedin.com</w:t>
+        </w:r>
+      </w:hyperlink>
+      <w:r>
+        <w:rPr>
+          <w:rFonts w:ascii="Times New Roman" w:eastAsia="Times New Roman" w:hAnsi="Times New Roman" w:cs="Times New Roman"/>
+          <w:spacing w:val="0"/>
+          <w:kern w:val="0"/>
+          <w:sz w:val="24"/>
+          <w:szCs w:val="24"/>
+          <w:lang w:eastAsia="en-IN"/>
+          <w14:ligatures w14:val="none"/>
+        </w:rPr>
+        <w:t xml:space="preserve"> </w:t>
+      </w:r>
+    </w:p>
+    <w:p>
+      <w:pPr>
+        <w:pStyle w:val="Title"/>
+        <w:numPr>
+          <w:ilvl w:val="0"/>
+          <w:numId w:val="3"/>
+        </w:numPr>
+        <w:rPr>
+          <w:rFonts w:ascii="Times New Roman" w:eastAsia="Times New Roman" w:hAnsi="Times New Roman" w:cs="Times New Roman"/>
+          <w:spacing w:val="0"/>
+          <w:kern w:val="0"/>
+          <w:sz w:val="24"/>
+          <w:szCs w:val="24"/>
+          <w:lang w:eastAsia="en-IN"/>
+          <w14:ligatures w14:val="none"/>
+        </w:rPr>
+      </w:pPr>
+      <w:r>
+        <w:rPr>
+          <w:rFonts w:ascii="Times New Roman" w:eastAsia="Times New Roman" w:hAnsi="Times New Roman" w:cs="Times New Roman"/>
+          <w:spacing w:val="0"/>
+          <w:kern w:val="0"/>
+          <w:sz w:val="24"/>
+          <w:szCs w:val="24"/>
+          <w:lang w:eastAsia="en-IN"/>
+          <w14:ligatures w14:val="none"/>
+        </w:rPr>
+        <w:t xml:space="preserve">Kaggle – </w:t>
+      </w:r>
+      <w:hyperlink r:id="rId9" w:tgtFrame="_new" w:history="1">
+        <w:r>
+          <w:rPr>
+            <w:rFonts w:ascii="Times New Roman" w:eastAsia="Times New Roman" w:hAnsi="Times New Roman" w:cs="Times New Roman"/>
+            <w:spacing w:val="0"/>
+            <w:kern w:val="0"/>
+            <w:sz w:val="24"/>
+            <w:szCs w:val="24"/>
+            <w:lang w:eastAsia="en-IN"/>
+            <w14:ligatures w14:val="none"/>
+          </w:rPr>
+          <w:t>https://www.kaggle.com</w:t>
+        </w:r>
+      </w:hyperlink>
+      <w:r>
+        <w:rPr>
+          <w:rFonts w:ascii="Times New Roman" w:eastAsia="Times New Roman" w:hAnsi="Times New Roman" w:cs="Times New Roman"/>
+          <w:spacing w:val="0"/>
+          <w:kern w:val="0"/>
+          <w:sz w:val="24"/>
+          <w:szCs w:val="24"/>
+          <w:lang w:eastAsia="en-IN"/>
+          <w14:ligatures w14:val="none"/>
+        </w:rPr>
+        <w:t xml:space="preserve"> </w:t>
+      </w:r>
+    </w:p>
+    <w:p>
+      <w:pPr>
+        <w:pStyle w:val="Title"/>
+        <w:numPr>
+          <w:ilvl w:val="0"/>
+          <w:numId w:val="3"/>
+        </w:numPr>
+        <w:rPr>
+          <w:rFonts w:ascii="Times New Roman" w:eastAsia="Times New Roman" w:hAnsi="Times New Roman" w:cs="Times New Roman"/>
+          <w:spacing w:val="0"/>
+          <w:kern w:val="0"/>
+          <w:sz w:val="24"/>
+          <w:szCs w:val="24"/>
+          <w:lang w:eastAsia="en-IN"/>
+          <w14:ligatures w14:val="none"/>
+        </w:rPr>
+      </w:pPr>
+      <w:r>
+        <w:rPr>
+          <w:rFonts w:ascii="Times New Roman" w:eastAsia="Times New Roman" w:hAnsi="Times New Roman" w:cs="Times New Roman"/>
+          <w:spacing w:val="0"/>
+          <w:kern w:val="0"/>
+          <w:sz w:val="24"/>
+          <w:szCs w:val="24"/>
+          <w:lang w:eastAsia="en-IN"/>
+          <w14:ligatures w14:val="none"/>
+        </w:rPr>
+        <w:t xml:space="preserve">Stack Overflow – </w:t>
+      </w:r>
+      <w:hyperlink r:id="rId10" w:tgtFrame="_new" w:history="1">
+        <w:r>
+          <w:rPr>
+            <w:rFonts w:ascii="Times New Roman" w:eastAsia="Times New Roman" w:hAnsi="Times New Roman" w:cs="Times New Roman"/>
+            <w:spacing w:val="0"/>
+            <w:kern w:val="0"/>
+            <w:sz w:val="24"/>
+            <w:szCs w:val="24"/>
+            <w:lang w:eastAsia="en-IN"/>
+            <w14:ligatures w14:val="none"/>
+          </w:rPr>
+          <w:t>https://stackoverflow.com</w:t>
+        </w:r>
+      </w:hyperlink>
+      <w:r>
+        <w:rPr>
+          <w:rFonts w:ascii="Times New Roman" w:eastAsia="Times New Roman" w:hAnsi="Times New Roman" w:cs="Times New Roman"/>
+          <w:spacing w:val="0"/>
+          <w:kern w:val="0"/>
+          <w:sz w:val="24"/>
+          <w:szCs w:val="24"/>
+          <w:lang w:eastAsia="en-IN"/>
+          <w14:ligatures w14:val="none"/>
+        </w:rPr>
+        <w:t xml:space="preserve"> </w:t>
+      </w:r>
+    </w:p>
+    <w:p>
+      <w:pPr>
+        <w:pStyle w:val="Title"/>
+        <w:numPr>
+          <w:ilvl w:val="0"/>
+          <w:numId w:val="3"/>
+        </w:numPr>
+        <w:rPr>
+          <w:rFonts w:ascii="Times New Roman" w:eastAsia="Times New Roman" w:hAnsi="Times New Roman" w:cs="Times New Roman"/>
+          <w:spacing w:val="0"/>
+          <w:kern w:val="0"/>
+          <w:sz w:val="24"/>
+          <w:szCs w:val="24"/>
+          <w:lang w:eastAsia="en-IN"/>
+          <w14:ligatures w14:val="none"/>
+        </w:rPr>
+      </w:pPr>
       <w:proofErr w:type="spellStart"/>
       <w:r>
         <w:rPr>
-          <w:sz w:val="36"/>
-          <w:szCs w:val="36"/>
+          <w:rFonts w:ascii="Times New Roman" w:eastAsia="Times New Roman" w:hAnsi="Times New Roman" w:cs="Times New Roman"/>
+          <w:spacing w:val="0"/>
+          <w:kern w:val="0"/>
+          <w:sz w:val="24"/>
+          <w:szCs w:val="24"/>
+          <w:lang w:eastAsia="en-IN"/>
+          <w14:ligatures w14:val="none"/>
         </w:rPr>
         <w:t>HackerRank</w:t>
       </w:r>
       <w:proofErr w:type="spellEnd"/>
       <w:r>
         <w:rPr>
-          <w:sz w:val="36"/>
-          <w:szCs w:val="36"/>
-        </w:rPr>
-        <w:t xml:space="preserve"> to solve a beginner-level problem called “Solve Me First.” This helped me understand how to take input, process it, and display output correctly in a coding environment. It was a simple problem but it gave me confidence in using the platform and understanding how programming challenges are structured. It also made me realize the importance of logic and accuracy in even basic problems.</w:t>
-      </w:r>
-    </w:p>
-    <w:p>
-      <w:pPr>
-        <w:pStyle w:val="NormalWeb"/>
-        <w:rPr>
-          <w:sz w:val="36"/>
-          <w:szCs w:val="36"/>
-        </w:rPr>
-      </w:pPr>
-    </w:p>
-    <w:p>
-      <w:pPr>
-        <w:pStyle w:val="NormalWeb"/>
-        <w:rPr>
-          <w:sz w:val="36"/>
-          <w:szCs w:val="36"/>
-        </w:rPr>
-      </w:pPr>
-      <w:r>
-        <w:rPr>
-          <w:sz w:val="36"/>
-          <w:szCs w:val="36"/>
-        </w:rPr>
-        <w:t>For Part B, I created a Google Form as a Digital Literacy Awareness Quiz consisting of five questions. I included multiple-choice and short answer questions to make it interactive and useful for my classmates. I also viewed the responses in Google Sheets, which helped me understand how data is collected and organized automatically</w:t>
-      </w:r>
-      <w:r>
-        <w:rPr>
-          <w:sz w:val="36"/>
-          <w:szCs w:val="36"/>
-        </w:rPr>
-        <w:t xml:space="preserve"> in google Sheets</w:t>
-      </w:r>
-      <w:r>
-        <w:rPr>
-          <w:sz w:val="36"/>
-          <w:szCs w:val="36"/>
-        </w:rPr>
-        <w:t>.</w:t>
-      </w:r>
-    </w:p>
-    <w:p>
-      <w:pPr>
-        <w:pStyle w:val="NormalWeb"/>
-        <w:rPr>
-          <w:sz w:val="36"/>
-          <w:szCs w:val="36"/>
-        </w:rPr>
-      </w:pPr>
-    </w:p>
-    <w:p>
-      <w:pPr>
-        <w:pStyle w:val="NormalWeb"/>
-        <w:rPr>
-          <w:sz w:val="36"/>
-          <w:szCs w:val="36"/>
-        </w:rPr>
-      </w:pPr>
-      <w:r>
-        <w:rPr>
-          <w:sz w:val="36"/>
-          <w:szCs w:val="36"/>
-        </w:rPr>
-        <w:t xml:space="preserve">These tools will help me academically by improving my coding skills and making collaboration easier. Platforms like </w:t>
-      </w:r>
-      <w:proofErr w:type="spellStart"/>
-      <w:r>
-        <w:rPr>
-          <w:sz w:val="36"/>
-          <w:szCs w:val="36"/>
-        </w:rPr>
-        <w:t>HackerRank</w:t>
-      </w:r>
-      <w:proofErr w:type="spellEnd"/>
-      <w:r>
-        <w:rPr>
-          <w:sz w:val="36"/>
-          <w:szCs w:val="36"/>
-        </w:rPr>
-        <w:t xml:space="preserve"> will strengthen my problem-solving ability, while Google Forms will help me conduct surveys and organize information efficiently during projects and assignments.</w:t>
-      </w:r>
-    </w:p>
-    <w:p>
-      <w:pPr>
-        <w:pStyle w:val="Title"/>
-        <w:jc w:val="center"/>
-        <w:rPr>
-          <w:rFonts w:ascii="Times New Roman" w:hAnsi="Times New Roman" w:cs="Times New Roman"/>
-          <w:sz w:val="72"/>
-          <w:szCs w:val="72"/>
-        </w:rPr>
-      </w:pPr>
-      <w:r>
-        <w:rPr>
-          <w:rFonts w:ascii="Times New Roman" w:hAnsi="Times New Roman" w:cs="Times New Roman"/>
-          <w:sz w:val="72"/>
-          <w:szCs w:val="72"/>
-        </w:rPr>
-        <w:lastRenderedPageBreak/>
-        <w:t>TASK 4</w:t>
-      </w:r>
-    </w:p>
-    <w:p/>
-    <w:p>
-      <w:pPr>
-        <w:pStyle w:val="Heading1"/>
-        <w:rPr>
-          <w:rFonts w:ascii="Times New Roman" w:hAnsi="Times New Roman" w:cs="Times New Roman"/>
-          <w:sz w:val="44"/>
-          <w:szCs w:val="44"/>
-        </w:rPr>
-      </w:pPr>
-      <w:r>
-        <w:rPr>
-          <w:rFonts w:ascii="Times New Roman" w:hAnsi="Times New Roman" w:cs="Times New Roman"/>
-          <w:sz w:val="44"/>
-          <w:szCs w:val="44"/>
-        </w:rPr>
-        <w:t>Draft a Professional Email &amp; Etiquette Guide</w:t>
-      </w:r>
-    </w:p>
-    <w:p/>
-    <w:p>
-      <w:pPr>
-        <w:pStyle w:val="NormalWeb"/>
-        <w:rPr>
-          <w:sz w:val="36"/>
-          <w:szCs w:val="36"/>
-        </w:rPr>
-      </w:pPr>
-      <w:r>
-        <w:rPr>
-          <w:sz w:val="36"/>
-          <w:szCs w:val="36"/>
-        </w:rPr>
-        <w:t>One situation where poor digital communication can cause a serious problem is when a student sends an unprofessional or unclear email to a professor. For instance, if a student writes an email without a proper subject line, uses overly casual language like “Hey,” or does not clearly explain the purpose of the message, the professor may misunderstand the request or fail to recognize its importance. In some cases, such emails might be ignored or delayed, which can lead to negative consequences such as missing assignment deadlines, not receiving important clarifications, or even losing the chance to request an extension.</w:t>
-      </w:r>
-    </w:p>
-    <w:p>
-      <w:pPr>
-        <w:pStyle w:val="NormalWeb"/>
-        <w:rPr>
-          <w:sz w:val="36"/>
-          <w:szCs w:val="36"/>
-        </w:rPr>
-      </w:pPr>
-    </w:p>
-    <w:p>
-      <w:pPr>
-        <w:pStyle w:val="NormalWeb"/>
-        <w:rPr>
-          <w:sz w:val="36"/>
-          <w:szCs w:val="36"/>
-        </w:rPr>
-      </w:pPr>
-      <w:r>
-        <w:rPr>
-          <w:sz w:val="36"/>
-          <w:szCs w:val="36"/>
-        </w:rPr>
-        <w:t>This issue could have been avoided by following proper email etiquette. The student should include a clear and relevant subject line that reflects the purpose of the email, use a respectful greeting, and present their message in a structured and polite manner. It is also important to keep the content concise while including all necessary details. Additionally, proofreading the email before sending it can help avoid grammatical errors and improve clarity. Overall, clear and professional digital communication ensures that the message is understood correctly and helps build a positive and respectful impression.</w:t>
-      </w:r>
-    </w:p>
-    <w:p/>
-    <w:p>
-      <w:pPr>
-        <w:pStyle w:val="Title"/>
-        <w:jc w:val="center"/>
-        <w:rPr>
-          <w:rFonts w:ascii="Times New Roman" w:hAnsi="Times New Roman" w:cs="Times New Roman"/>
-          <w:sz w:val="72"/>
-          <w:szCs w:val="72"/>
-        </w:rPr>
-      </w:pPr>
-      <w:r>
-        <w:rPr>
-          <w:rFonts w:ascii="Times New Roman" w:hAnsi="Times New Roman" w:cs="Times New Roman"/>
-          <w:sz w:val="72"/>
-          <w:szCs w:val="72"/>
-        </w:rPr>
-        <w:lastRenderedPageBreak/>
-        <w:t>Task 5</w:t>
-      </w:r>
-    </w:p>
-    <w:p/>
-    <w:p>
-      <w:pPr>
-        <w:pStyle w:val="Heading1"/>
-        <w:rPr>
-          <w:rFonts w:ascii="Times New Roman" w:hAnsi="Times New Roman" w:cs="Times New Roman"/>
-          <w:sz w:val="44"/>
-          <w:szCs w:val="44"/>
-        </w:rPr>
-      </w:pPr>
-      <w:r>
-        <w:rPr>
-          <w:rFonts w:ascii="Times New Roman" w:hAnsi="Times New Roman" w:cs="Times New Roman"/>
-          <w:sz w:val="44"/>
-          <w:szCs w:val="44"/>
-        </w:rPr>
-        <w:t>Cybercrime Awareness Case Study &amp; Prevention Guide</w:t>
-      </w:r>
-    </w:p>
-    <w:p/>
-    <w:p>
-      <w:pPr>
-        <w:pStyle w:val="NormalWeb"/>
-        <w:rPr>
-          <w:sz w:val="36"/>
-          <w:szCs w:val="36"/>
-        </w:rPr>
-      </w:pPr>
-      <w:r>
-        <w:rPr>
-          <w:sz w:val="36"/>
-          <w:szCs w:val="36"/>
-        </w:rPr>
-        <w:t>While researching and creating the</w:t>
-      </w:r>
-      <w:r>
-        <w:rPr>
-          <w:sz w:val="36"/>
-          <w:szCs w:val="36"/>
+          <w:rFonts w:ascii="Times New Roman" w:eastAsia="Times New Roman" w:hAnsi="Times New Roman" w:cs="Times New Roman"/>
+          <w:spacing w:val="0"/>
+          <w:kern w:val="0"/>
+          <w:sz w:val="24"/>
+          <w:szCs w:val="24"/>
+          <w:lang w:eastAsia="en-IN"/>
+          <w14:ligatures w14:val="none"/>
+        </w:rPr>
+        <w:t xml:space="preserve"> – </w:t>
+      </w:r>
+      <w:hyperlink r:id="rId11" w:tgtFrame="_new" w:history="1">
+        <w:r>
+          <w:rPr>
+            <w:rFonts w:ascii="Times New Roman" w:eastAsia="Times New Roman" w:hAnsi="Times New Roman" w:cs="Times New Roman"/>
+            <w:spacing w:val="0"/>
+            <w:kern w:val="0"/>
+            <w:sz w:val="24"/>
+            <w:szCs w:val="24"/>
+            <w:lang w:eastAsia="en-IN"/>
+            <w14:ligatures w14:val="none"/>
+          </w:rPr>
+          <w:t>https://www.hackerrank.com</w:t>
+        </w:r>
+      </w:hyperlink>
+      <w:r>
+        <w:rPr>
+          <w:rFonts w:ascii="Times New Roman" w:eastAsia="Times New Roman" w:hAnsi="Times New Roman" w:cs="Times New Roman"/>
+          <w:spacing w:val="0"/>
+          <w:kern w:val="0"/>
+          <w:sz w:val="24"/>
+          <w:szCs w:val="24"/>
+          <w:lang w:eastAsia="en-IN"/>
+          <w14:ligatures w14:val="none"/>
         </w:rPr>
         <w:t xml:space="preserve"> </w:t>
       </w:r>
-      <w:r>
-        <w:rPr>
-          <w:sz w:val="36"/>
-          <w:szCs w:val="36"/>
-        </w:rPr>
-        <w:t>Stay Safe Online</w:t>
-      </w:r>
-      <w:r>
-        <w:rPr>
-          <w:sz w:val="36"/>
-          <w:szCs w:val="36"/>
+    </w:p>
+    <w:p>
+      <w:pPr>
+        <w:pStyle w:val="Title"/>
+        <w:numPr>
+          <w:ilvl w:val="0"/>
+          <w:numId w:val="3"/>
+        </w:numPr>
+        <w:rPr>
+          <w:rFonts w:ascii="Times New Roman" w:eastAsia="Times New Roman" w:hAnsi="Times New Roman" w:cs="Times New Roman"/>
+          <w:spacing w:val="0"/>
+          <w:kern w:val="0"/>
+          <w:sz w:val="24"/>
+          <w:szCs w:val="24"/>
+          <w:lang w:eastAsia="en-IN"/>
+          <w14:ligatures w14:val="none"/>
+        </w:rPr>
+      </w:pPr>
+      <w:r>
+        <w:rPr>
+          <w:rFonts w:ascii="Times New Roman" w:eastAsia="Times New Roman" w:hAnsi="Times New Roman" w:cs="Times New Roman"/>
+          <w:spacing w:val="0"/>
+          <w:kern w:val="0"/>
+          <w:sz w:val="24"/>
+          <w:szCs w:val="24"/>
+          <w:lang w:eastAsia="en-IN"/>
+          <w14:ligatures w14:val="none"/>
+        </w:rPr>
+        <w:t xml:space="preserve">Google Forms – </w:t>
+      </w:r>
+      <w:hyperlink r:id="rId12" w:tgtFrame="_new" w:history="1">
+        <w:r>
+          <w:rPr>
+            <w:rFonts w:ascii="Times New Roman" w:eastAsia="Times New Roman" w:hAnsi="Times New Roman" w:cs="Times New Roman"/>
+            <w:spacing w:val="0"/>
+            <w:kern w:val="0"/>
+            <w:sz w:val="24"/>
+            <w:szCs w:val="24"/>
+            <w:lang w:eastAsia="en-IN"/>
+            <w14:ligatures w14:val="none"/>
+          </w:rPr>
+          <w:t>https://forms.google.com</w:t>
+        </w:r>
+      </w:hyperlink>
+      <w:r>
+        <w:rPr>
+          <w:rFonts w:ascii="Times New Roman" w:eastAsia="Times New Roman" w:hAnsi="Times New Roman" w:cs="Times New Roman"/>
+          <w:spacing w:val="0"/>
+          <w:kern w:val="0"/>
+          <w:sz w:val="24"/>
+          <w:szCs w:val="24"/>
+          <w:lang w:eastAsia="en-IN"/>
+          <w14:ligatures w14:val="none"/>
         </w:rPr>
         <w:t xml:space="preserve"> </w:t>
       </w:r>
-      <w:r>
-        <w:rPr>
-          <w:sz w:val="36"/>
-          <w:szCs w:val="36"/>
-        </w:rPr>
-        <w:t>prevention checklist what surprised me the most was how many common online habits can actually lead to serious security risks. I realized that many students including myself</w:t>
-      </w:r>
-      <w:r>
-        <w:rPr>
-          <w:sz w:val="36"/>
-          <w:szCs w:val="36"/>
-        </w:rPr>
-        <w:t xml:space="preserve"> </w:t>
-      </w:r>
-      <w:r>
-        <w:rPr>
-          <w:sz w:val="36"/>
-          <w:szCs w:val="36"/>
-        </w:rPr>
-        <w:t>often overlook basic precautions like checking website authenticity or ignoring suspicious links. I was also surprised to learn how frequently financial fraud happens through UPI especially when people unknowingly approve payment requests or share sensitive information like OTPs</w:t>
-      </w:r>
-      <w:r>
-        <w:rPr>
-          <w:sz w:val="36"/>
-          <w:szCs w:val="36"/>
-        </w:rPr>
-        <w:t>,</w:t>
-      </w:r>
-      <w:r>
-        <w:rPr>
-          <w:sz w:val="36"/>
-          <w:szCs w:val="36"/>
-        </w:rPr>
-        <w:t xml:space="preserve"> </w:t>
-      </w:r>
-      <w:proofErr w:type="gramStart"/>
-      <w:r>
-        <w:rPr>
-          <w:sz w:val="36"/>
-          <w:szCs w:val="36"/>
-        </w:rPr>
-        <w:t>These</w:t>
-      </w:r>
-      <w:proofErr w:type="gramEnd"/>
-      <w:r>
-        <w:rPr>
-          <w:sz w:val="36"/>
-          <w:szCs w:val="36"/>
-        </w:rPr>
-        <w:t xml:space="preserve"> small mistakes can lead to significant financial and personal loss.</w:t>
-      </w:r>
-    </w:p>
-    <w:p>
-      <w:pPr>
-        <w:pStyle w:val="NormalWeb"/>
-      </w:pPr>
-      <w:r>
-        <w:rPr>
-          <w:sz w:val="36"/>
-          <w:szCs w:val="36"/>
-        </w:rPr>
-        <w:t>As a result of this research, one habit I will personally change is being more cautious while handling online transactions and messages. I will make it a point to always verify payment requests and avoid clicking on unknown links. Additionally, I will enable stronger security measures like two-factor authentication on my accounts. This activity has helped me understand the importance of being alert and responsible online, and I will apply these practices in my daily digital interactions</w:t>
-      </w:r>
-      <w:r>
-        <w:t>.</w:t>
-      </w:r>
-    </w:p>
-    <w:p/>
+    </w:p>
+    <w:p>
+      <w:pPr>
+        <w:pStyle w:val="Title"/>
+        <w:numPr>
+          <w:ilvl w:val="0"/>
+          <w:numId w:val="3"/>
+        </w:numPr>
+        <w:rPr>
+          <w:rFonts w:ascii="Times New Roman" w:eastAsia="Times New Roman" w:hAnsi="Times New Roman" w:cs="Times New Roman"/>
+          <w:spacing w:val="0"/>
+          <w:kern w:val="0"/>
+          <w:sz w:val="24"/>
+          <w:szCs w:val="24"/>
+          <w:lang w:eastAsia="en-IN"/>
+          <w14:ligatures w14:val="none"/>
+        </w:rPr>
+      </w:pPr>
+      <w:r>
+        <w:rPr>
+          <w:rFonts w:ascii="Times New Roman" w:eastAsia="Times New Roman" w:hAnsi="Times New Roman" w:cs="Times New Roman"/>
+          <w:spacing w:val="0"/>
+          <w:kern w:val="0"/>
+          <w:sz w:val="24"/>
+          <w:szCs w:val="24"/>
+          <w:lang w:eastAsia="en-IN"/>
+          <w14:ligatures w14:val="none"/>
+        </w:rPr>
+        <w:t xml:space="preserve">National Cyber Crime Portal – </w:t>
+      </w:r>
+      <w:hyperlink r:id="rId13" w:tgtFrame="_new" w:history="1">
+        <w:r>
+          <w:rPr>
+            <w:rFonts w:ascii="Times New Roman" w:eastAsia="Times New Roman" w:hAnsi="Times New Roman" w:cs="Times New Roman"/>
+            <w:spacing w:val="0"/>
+            <w:kern w:val="0"/>
+            <w:sz w:val="24"/>
+            <w:szCs w:val="24"/>
+            <w:lang w:eastAsia="en-IN"/>
+            <w14:ligatures w14:val="none"/>
+          </w:rPr>
+          <w:t>https://cybercrime.gov.in</w:t>
+        </w:r>
+      </w:hyperlink>
+    </w:p>
+    <w:p>
+      <w:pPr>
+        <w:pStyle w:val="Title"/>
+        <w:rPr>
+          <w:rFonts w:ascii="Times New Roman" w:eastAsia="Times New Roman" w:hAnsi="Times New Roman" w:cs="Times New Roman"/>
+          <w:spacing w:val="0"/>
+          <w:kern w:val="0"/>
+          <w:sz w:val="24"/>
+          <w:szCs w:val="24"/>
+          <w:lang w:eastAsia="en-IN"/>
+          <w14:ligatures w14:val="none"/>
+        </w:rPr>
+      </w:pPr>
+    </w:p>
     <w:sectPr>
       <w:pgSz w:w="11906" w:h="16838"/>
       <w:pgMar w:top="1440" w:right="1440" w:bottom="1440" w:left="1440" w:header="708" w:footer="708" w:gutter="0"/>
@@ -845,6 +1920,305 @@
     </w:sectPr>
   </w:body>
 </w:document>
+</file>
+
+<file path=word/numbering.xml><?xml version="1.0" encoding="utf-8"?>
+<w:numbering xmlns:wpc="http://schemas.microsoft.com/office/word/2010/wordprocessingCanvas" xmlns:cx="http://schemas.microsoft.com/office/drawing/2014/chartex" xmlns:cx1="http://schemas.microsoft.com/office/drawing/2015/9/8/chartex" xmlns:cx2="http://schemas.microsoft.com/office/drawing/2015/10/21/chartex" xmlns:cx3="http://schemas.microsoft.com/office/drawing/2016/5/9/chartex" xmlns:cx4="http://schemas.microsoft.com/office/drawing/2016/5/10/chartex" xmlns:cx5="http://schemas.microsoft.com/office/drawing/2016/5/11/chartex" xmlns:cx6="http://schemas.microsoft.com/office/drawing/2016/5/12/chartex" xmlns:cx7="http://schemas.microsoft.com/office/drawing/2016/5/13/chartex" xmlns:cx8="http://schemas.microsoft.com/office/drawing/2016/5/14/chartex" xmlns:mc="http://schemas.openxmlformats.org/markup-compatibility/2006" xmlns:aink="http://schemas.microsoft.com/office/drawing/2016/ink" xmlns:am3d="http://schemas.microsoft.com/office/drawing/2017/model3d" xmlns:o="urn:schemas-microsoft-com:office:office" xmlns:oel="http://schemas.microsoft.com/office/2019/extlst" xmlns:r="http://schemas.openxmlformats.org/officeDocument/2006/relationships" xmlns:m="http://schemas.openxmlformats.org/officeDocument/2006/math" xmlns:v="urn:schemas-microsoft-com:vml" xmlns:wp14="http://schemas.microsoft.com/office/word/2010/wordprocessingDrawing" xmlns:wp="http://schemas.openxmlformats.org/drawingml/2006/wordprocessingDrawing" xmlns:w10="urn:schemas-microsoft-com:office:word" xmlns:w="http://schemas.openxmlformats.org/wordprocessingml/2006/main" xmlns:w14="http://schemas.microsoft.com/office/word/2010/wordml" xmlns:w15="http://schemas.microsoft.com/office/word/2012/wordml" xmlns:w16cex="http://schemas.microsoft.com/office/word/2018/wordml/cex" xmlns:w16cid="http://schemas.microsoft.com/office/word/2016/wordml/cid" xmlns:w16="http://schemas.microsoft.com/office/word/2018/wordml" xmlns:w16du="http://schemas.microsoft.com/office/word/2023/wordml/word16du" xmlns:w16sdtdh="http://schemas.microsoft.com/office/word/2020/wordml/sdtdatahash" xmlns:w16sdtfl="http://schemas.microsoft.com/office/word/2024/wordml/sdtformatlock" xmlns:w16se="http://schemas.microsoft.com/office/word/2015/wordml/symex" xmlns:wpg="http://schemas.microsoft.com/office/word/2010/wordprocessingGroup" xmlns:wpi="http://schemas.microsoft.com/office/word/2010/wordprocessingInk" xmlns:wne="http://schemas.microsoft.com/office/word/2006/wordml" xmlns:wps="http://schemas.microsoft.com/office/word/2010/wordprocessingShape" mc:Ignorable="w14 w15 w16se w16cid w16 w16cex w16sdtdh w16sdtfl w16du wp14">
+  <w:abstractNum w:abstractNumId="0" w15:restartNumberingAfterBreak="0">
+    <w:nsid w:val="20C3102E"/>
+    <w:multiLevelType w:val="hybridMultilevel"/>
+    <w:tmpl w:val="B25AD242"/>
+    <w:lvl w:ilvl="0" w:tplc="4009000F">
+      <w:start w:val="1"/>
+      <w:numFmt w:val="decimal"/>
+      <w:lvlText w:val="%1."/>
+      <w:lvlJc w:val="left"/>
+      <w:pPr>
+        <w:ind w:left="720" w:hanging="360"/>
+      </w:pPr>
+    </w:lvl>
+    <w:lvl w:ilvl="1" w:tplc="40090019" w:tentative="1">
+      <w:start w:val="1"/>
+      <w:numFmt w:val="lowerLetter"/>
+      <w:lvlText w:val="%2."/>
+      <w:lvlJc w:val="left"/>
+      <w:pPr>
+        <w:ind w:left="1440" w:hanging="360"/>
+      </w:pPr>
+    </w:lvl>
+    <w:lvl w:ilvl="2" w:tplc="4009001B" w:tentative="1">
+      <w:start w:val="1"/>
+      <w:numFmt w:val="lowerRoman"/>
+      <w:lvlText w:val="%3."/>
+      <w:lvlJc w:val="right"/>
+      <w:pPr>
+        <w:ind w:left="2160" w:hanging="180"/>
+      </w:pPr>
+    </w:lvl>
+    <w:lvl w:ilvl="3" w:tplc="4009000F" w:tentative="1">
+      <w:start w:val="1"/>
+      <w:numFmt w:val="decimal"/>
+      <w:lvlText w:val="%4."/>
+      <w:lvlJc w:val="left"/>
+      <w:pPr>
+        <w:ind w:left="2880" w:hanging="360"/>
+      </w:pPr>
+    </w:lvl>
+    <w:lvl w:ilvl="4" w:tplc="40090019" w:tentative="1">
+      <w:start w:val="1"/>
+      <w:numFmt w:val="lowerLetter"/>
+      <w:lvlText w:val="%5."/>
+      <w:lvlJc w:val="left"/>
+      <w:pPr>
+        <w:ind w:left="3600" w:hanging="360"/>
+      </w:pPr>
+    </w:lvl>
+    <w:lvl w:ilvl="5" w:tplc="4009001B" w:tentative="1">
+      <w:start w:val="1"/>
+      <w:numFmt w:val="lowerRoman"/>
+      <w:lvlText w:val="%6."/>
+      <w:lvlJc w:val="right"/>
+      <w:pPr>
+        <w:ind w:left="4320" w:hanging="180"/>
+      </w:pPr>
+    </w:lvl>
+    <w:lvl w:ilvl="6" w:tplc="4009000F" w:tentative="1">
+      <w:start w:val="1"/>
+      <w:numFmt w:val="decimal"/>
+      <w:lvlText w:val="%7."/>
+      <w:lvlJc w:val="left"/>
+      <w:pPr>
+        <w:ind w:left="5040" w:hanging="360"/>
+      </w:pPr>
+    </w:lvl>
+    <w:lvl w:ilvl="7" w:tplc="40090019" w:tentative="1">
+      <w:start w:val="1"/>
+      <w:numFmt w:val="lowerLetter"/>
+      <w:lvlText w:val="%8."/>
+      <w:lvlJc w:val="left"/>
+      <w:pPr>
+        <w:ind w:left="5760" w:hanging="360"/>
+      </w:pPr>
+    </w:lvl>
+    <w:lvl w:ilvl="8" w:tplc="4009001B" w:tentative="1">
+      <w:start w:val="1"/>
+      <w:numFmt w:val="lowerRoman"/>
+      <w:lvlText w:val="%9."/>
+      <w:lvlJc w:val="right"/>
+      <w:pPr>
+        <w:ind w:left="6480" w:hanging="180"/>
+      </w:pPr>
+    </w:lvl>
+  </w:abstractNum>
+  <w:abstractNum w:abstractNumId="1" w15:restartNumberingAfterBreak="0">
+    <w:nsid w:val="2CD47C4F"/>
+    <w:multiLevelType w:val="hybridMultilevel"/>
+    <w:tmpl w:val="72EE7F2C"/>
+    <w:lvl w:ilvl="0" w:tplc="4009000F">
+      <w:start w:val="1"/>
+      <w:numFmt w:val="decimal"/>
+      <w:lvlText w:val="%1."/>
+      <w:lvlJc w:val="left"/>
+      <w:pPr>
+        <w:ind w:left="720" w:hanging="360"/>
+      </w:pPr>
+    </w:lvl>
+    <w:lvl w:ilvl="1" w:tplc="40090019" w:tentative="1">
+      <w:start w:val="1"/>
+      <w:numFmt w:val="lowerLetter"/>
+      <w:lvlText w:val="%2."/>
+      <w:lvlJc w:val="left"/>
+      <w:pPr>
+        <w:ind w:left="1440" w:hanging="360"/>
+      </w:pPr>
+    </w:lvl>
+    <w:lvl w:ilvl="2" w:tplc="4009001B" w:tentative="1">
+      <w:start w:val="1"/>
+      <w:numFmt w:val="lowerRoman"/>
+      <w:lvlText w:val="%3."/>
+      <w:lvlJc w:val="right"/>
+      <w:pPr>
+        <w:ind w:left="2160" w:hanging="180"/>
+      </w:pPr>
+    </w:lvl>
+    <w:lvl w:ilvl="3" w:tplc="4009000F" w:tentative="1">
+      <w:start w:val="1"/>
+      <w:numFmt w:val="decimal"/>
+      <w:lvlText w:val="%4."/>
+      <w:lvlJc w:val="left"/>
+      <w:pPr>
+        <w:ind w:left="2880" w:hanging="360"/>
+      </w:pPr>
+    </w:lvl>
+    <w:lvl w:ilvl="4" w:tplc="40090019" w:tentative="1">
+      <w:start w:val="1"/>
+      <w:numFmt w:val="lowerLetter"/>
+      <w:lvlText w:val="%5."/>
+      <w:lvlJc w:val="left"/>
+      <w:pPr>
+        <w:ind w:left="3600" w:hanging="360"/>
+      </w:pPr>
+    </w:lvl>
+    <w:lvl w:ilvl="5" w:tplc="4009001B" w:tentative="1">
+      <w:start w:val="1"/>
+      <w:numFmt w:val="lowerRoman"/>
+      <w:lvlText w:val="%6."/>
+      <w:lvlJc w:val="right"/>
+      <w:pPr>
+        <w:ind w:left="4320" w:hanging="180"/>
+      </w:pPr>
+    </w:lvl>
+    <w:lvl w:ilvl="6" w:tplc="4009000F" w:tentative="1">
+      <w:start w:val="1"/>
+      <w:numFmt w:val="decimal"/>
+      <w:lvlText w:val="%7."/>
+      <w:lvlJc w:val="left"/>
+      <w:pPr>
+        <w:ind w:left="5040" w:hanging="360"/>
+      </w:pPr>
+    </w:lvl>
+    <w:lvl w:ilvl="7" w:tplc="40090019" w:tentative="1">
+      <w:start w:val="1"/>
+      <w:numFmt w:val="lowerLetter"/>
+      <w:lvlText w:val="%8."/>
+      <w:lvlJc w:val="left"/>
+      <w:pPr>
+        <w:ind w:left="5760" w:hanging="360"/>
+      </w:pPr>
+    </w:lvl>
+    <w:lvl w:ilvl="8" w:tplc="4009001B" w:tentative="1">
+      <w:start w:val="1"/>
+      <w:numFmt w:val="lowerRoman"/>
+      <w:lvlText w:val="%9."/>
+      <w:lvlJc w:val="right"/>
+      <w:pPr>
+        <w:ind w:left="6480" w:hanging="180"/>
+      </w:pPr>
+    </w:lvl>
+  </w:abstractNum>
+  <w:abstractNum w:abstractNumId="2" w15:restartNumberingAfterBreak="0">
+    <w:nsid w:val="57A52BDB"/>
+    <w:multiLevelType w:val="multilevel"/>
+    <w:tmpl w:val="6A442B46"/>
+    <w:lvl w:ilvl="0">
+      <w:start w:val="1"/>
+      <w:numFmt w:val="decimal"/>
+      <w:lvlText w:val="%1."/>
+      <w:lvlJc w:val="left"/>
+      <w:pPr>
+        <w:tabs>
+          <w:tab w:val="num" w:pos="720"/>
+        </w:tabs>
+        <w:ind w:left="720" w:hanging="360"/>
+      </w:pPr>
+    </w:lvl>
+    <w:lvl w:ilvl="1" w:tentative="1">
+      <w:start w:val="1"/>
+      <w:numFmt w:val="decimal"/>
+      <w:lvlText w:val="%2."/>
+      <w:lvlJc w:val="left"/>
+      <w:pPr>
+        <w:tabs>
+          <w:tab w:val="num" w:pos="1440"/>
+        </w:tabs>
+        <w:ind w:left="1440" w:hanging="360"/>
+      </w:pPr>
+    </w:lvl>
+    <w:lvl w:ilvl="2" w:tentative="1">
+      <w:start w:val="1"/>
+      <w:numFmt w:val="decimal"/>
+      <w:lvlText w:val="%3."/>
+      <w:lvlJc w:val="left"/>
+      <w:pPr>
+        <w:tabs>
+          <w:tab w:val="num" w:pos="2160"/>
+        </w:tabs>
+        <w:ind w:left="2160" w:hanging="360"/>
+      </w:pPr>
+    </w:lvl>
+    <w:lvl w:ilvl="3" w:tentative="1">
+      <w:start w:val="1"/>
+      <w:numFmt w:val="decimal"/>
+      <w:lvlText w:val="%4."/>
+      <w:lvlJc w:val="left"/>
+      <w:pPr>
+        <w:tabs>
+          <w:tab w:val="num" w:pos="2880"/>
+        </w:tabs>
+        <w:ind w:left="2880" w:hanging="360"/>
+      </w:pPr>
+    </w:lvl>
+    <w:lvl w:ilvl="4" w:tentative="1">
+      <w:start w:val="1"/>
+      <w:numFmt w:val="decimal"/>
+      <w:lvlText w:val="%5."/>
+      <w:lvlJc w:val="left"/>
+      <w:pPr>
+        <w:tabs>
+          <w:tab w:val="num" w:pos="3600"/>
+        </w:tabs>
+        <w:ind w:left="3600" w:hanging="360"/>
+      </w:pPr>
+    </w:lvl>
+    <w:lvl w:ilvl="5" w:tentative="1">
+      <w:start w:val="1"/>
+      <w:numFmt w:val="decimal"/>
+      <w:lvlText w:val="%6."/>
+      <w:lvlJc w:val="left"/>
+      <w:pPr>
+        <w:tabs>
+          <w:tab w:val="num" w:pos="4320"/>
+        </w:tabs>
+        <w:ind w:left="4320" w:hanging="360"/>
+      </w:pPr>
+    </w:lvl>
+    <w:lvl w:ilvl="6" w:tentative="1">
+      <w:start w:val="1"/>
+      <w:numFmt w:val="decimal"/>
+      <w:lvlText w:val="%7."/>
+      <w:lvlJc w:val="left"/>
+      <w:pPr>
+        <w:tabs>
+          <w:tab w:val="num" w:pos="5040"/>
+        </w:tabs>
+        <w:ind w:left="5040" w:hanging="360"/>
+      </w:pPr>
+    </w:lvl>
+    <w:lvl w:ilvl="7" w:tentative="1">
+      <w:start w:val="1"/>
+      <w:numFmt w:val="decimal"/>
+      <w:lvlText w:val="%8."/>
+      <w:lvlJc w:val="left"/>
+      <w:pPr>
+        <w:tabs>
+          <w:tab w:val="num" w:pos="5760"/>
+        </w:tabs>
+        <w:ind w:left="5760" w:hanging="360"/>
+      </w:pPr>
+    </w:lvl>
+    <w:lvl w:ilvl="8" w:tentative="1">
+      <w:start w:val="1"/>
+      <w:numFmt w:val="decimal"/>
+      <w:lvlText w:val="%9."/>
+      <w:lvlJc w:val="left"/>
+      <w:pPr>
+        <w:tabs>
+          <w:tab w:val="num" w:pos="6480"/>
+        </w:tabs>
+        <w:ind w:left="6480" w:hanging="360"/>
+      </w:pPr>
+    </w:lvl>
+  </w:abstractNum>
+  <w:num w:numId="1" w16cid:durableId="957683597">
+    <w:abstractNumId w:val="2"/>
+  </w:num>
+  <w:num w:numId="2" w16cid:durableId="1548057615">
+    <w:abstractNumId w:val="0"/>
+  </w:num>
+  <w:num w:numId="3" w16cid:durableId="1761098259">
+    <w:abstractNumId w:val="1"/>
+  </w:num>
+</w:numbering>
 </file>
 
 <file path=word/styles.xml><?xml version="1.0" encoding="utf-8"?>
@@ -1765,7 +3139,6 @@
     <w:name w:val="Normal (Web)"/>
     <w:basedOn w:val="Normal"/>
     <w:uiPriority w:val="99"/>
-    <w:semiHidden/>
     <w:unhideWhenUsed/>
     <w:rsid w:val="00563000"/>
     <w:pPr>
@@ -1792,6 +3165,29 @@
     <w:rPr>
       <w:i/>
       <w:iCs/>
+    </w:rPr>
+  </w:style>
+  <w:style w:type="character" w:styleId="Hyperlink">
+    <w:name w:val="Hyperlink"/>
+    <w:basedOn w:val="DefaultParagraphFont"/>
+    <w:uiPriority w:val="99"/>
+    <w:unhideWhenUsed/>
+    <w:rsid w:val="00E67EBE"/>
+    <w:rPr>
+      <w:color w:val="467886" w:themeColor="hyperlink"/>
+      <w:u w:val="single"/>
+    </w:rPr>
+  </w:style>
+  <w:style w:type="character" w:styleId="UnresolvedMention">
+    <w:name w:val="Unresolved Mention"/>
+    <w:basedOn w:val="DefaultParagraphFont"/>
+    <w:uiPriority w:val="99"/>
+    <w:semiHidden/>
+    <w:unhideWhenUsed/>
+    <w:rsid w:val="00E67EBE"/>
+    <w:rPr>
+      <w:color w:val="605E5C"/>
+      <w:shd w:val="clear" w:color="auto" w:fill="E1DFDD"/>
     </w:rPr>
   </w:style>
 </w:styles>

</xml_diff>